<commit_message>
writing more missions forward in the docx
</commit_message>
<xml_diff>
--- a/Hitting the Jackpot.docx
+++ b/Hitting the Jackpot.docx
@@ -955,13 +955,7 @@
             <w:rPr>
               <w:rFonts w:ascii="Cambria Math" w:hAnsi="Cambria Math" w:cs="David"/>
             </w:rPr>
-            <m:t>(</m:t>
-          </m:r>
-          <m:r>
-            <w:rPr>
-              <w:rFonts w:ascii="Cambria Math" w:hAnsi="Cambria Math" w:cs="David"/>
-            </w:rPr>
-            <m:t>x</m:t>
+            <m:t>(x</m:t>
           </m:r>
           <m:d>
             <m:dPr>
@@ -1594,11 +1588,17 @@
         </w:rPr>
         <w:t xml:space="preserve"> - in the file. To put it here and to start analyze each one of them, maybe the export the graphs to csv for the AI model to train on that data, or only to give him the most common freqs of each ball.</w:t>
       </w:r>
+      <w:r>
+        <w:rPr>
+          <w:rFonts w:ascii="David" w:hAnsi="David" w:cs="David"/>
+        </w:rPr>
+        <w:t xml:space="preserve"> Maybe to collide all the ffts together to one graph in order to see clearly the freq of each ball</w:t>
+      </w:r>
     </w:p>
     <w:p>
       <w:pPr>
         <w:rPr>
-          <w:rFonts w:ascii="David" w:hAnsi="David" w:cs="David" w:hint="cs"/>
+          <w:rFonts w:ascii="David" w:hAnsi="David" w:cs="David"/>
           <w:rtl/>
         </w:rPr>
       </w:pPr>
@@ -3006,6 +3006,7 @@
   <w:style w:type="character" w:default="1" w:styleId="DefaultParagraphFont">
     <w:name w:val="Default Paragraph Font"/>
     <w:uiPriority w:val="1"/>
+    <w:semiHidden/>
     <w:unhideWhenUsed/>
   </w:style>
   <w:style w:type="table" w:default="1" w:styleId="TableNormal">

</xml_diff>

<commit_message>
fixing dataset according to new rules
</commit_message>
<xml_diff>
--- a/Hitting the Jackpot.docx
+++ b/Hitting the Jackpot.docx
@@ -104,6 +104,46 @@
           <w:rFonts w:ascii="David" w:hAnsi="David" w:cs="David"/>
         </w:rPr>
         <w:t xml:space="preserve">Each 2 combinations (“tables”) costs 6 NIS. </w:t>
+      </w:r>
+    </w:p>
+    <w:p>
+      <w:pPr>
+        <w:rPr>
+          <w:rFonts w:ascii="David" w:hAnsi="David" w:cs="David"/>
+          <w:u w:val="single"/>
+        </w:rPr>
+      </w:pPr>
+      <w:r>
+        <w:rPr>
+          <w:rFonts w:ascii="David" w:hAnsi="David" w:cs="David"/>
+          <w:u w:val="single"/>
+        </w:rPr>
+        <w:t>Dataset</w:t>
+      </w:r>
+    </w:p>
+    <w:p>
+      <w:pPr>
+        <w:rPr>
+          <w:rFonts w:ascii="David" w:hAnsi="David" w:cs="David"/>
+        </w:rPr>
+      </w:pPr>
+      <w:r>
+        <w:rPr>
+          <w:rFonts w:ascii="David" w:hAnsi="David" w:cs="David"/>
+        </w:rPr>
+        <w:t>The new rules of the lottery applied since lottery number 203</w:t>
+      </w:r>
+      <w:r>
+        <w:rPr>
+          <w:rFonts w:ascii="David" w:hAnsi="David" w:cs="David"/>
+        </w:rPr>
+        <w:t>9</w:t>
+      </w:r>
+      <w:r>
+        <w:rPr>
+          <w:rFonts w:ascii="David" w:hAnsi="David" w:cs="David"/>
+        </w:rPr>
+        <w:t>.</w:t>
       </w:r>
     </w:p>
     <w:p>

</xml_diff>

<commit_message>
cleaning dataset second time and commenting in the book.
</commit_message>
<xml_diff>
--- a/Hitting the Jackpot.docx
+++ b/Hitting the Jackpot.docx
@@ -131,19 +131,73 @@
         <w:rPr>
           <w:rFonts w:ascii="David" w:hAnsi="David" w:cs="David"/>
         </w:rPr>
-        <w:t>The new rules of the lottery applied since lottery number 203</w:t>
-      </w:r>
-      <w:r>
-        <w:rPr>
-          <w:rFonts w:ascii="David" w:hAnsi="David" w:cs="David"/>
-        </w:rPr>
-        <w:t>9</w:t>
-      </w:r>
-      <w:r>
-        <w:rPr>
-          <w:rFonts w:ascii="David" w:hAnsi="David" w:cs="David"/>
-        </w:rPr>
-        <w:t>.</w:t>
+        <w:t>Data cleaning:</w:t>
+      </w:r>
+    </w:p>
+    <w:p>
+      <w:pPr>
+        <w:pStyle w:val="ListParagraph"/>
+        <w:numPr>
+          <w:ilvl w:val="0"/>
+          <w:numId w:val="7"/>
+        </w:numPr>
+        <w:rPr>
+          <w:rFonts w:ascii="David" w:hAnsi="David" w:cs="David"/>
+        </w:rPr>
+      </w:pPr>
+      <w:r>
+        <w:rPr>
+          <w:rFonts w:ascii="David" w:hAnsi="David" w:cs="David"/>
+        </w:rPr>
+        <w:t>The initial</w:t>
+      </w:r>
+      <w:r>
+        <w:rPr>
+          <w:rFonts w:ascii="David" w:hAnsi="David" w:cs="David"/>
+        </w:rPr>
+        <w:t xml:space="preserve"> rules of the lottery </w:t>
+      </w:r>
+      <w:r>
+        <w:rPr>
+          <w:rFonts w:ascii="David" w:hAnsi="David" w:cs="David"/>
+        </w:rPr>
+        <w:t>determined special number between 1 to 40 (cleaned 1500 lotteries from the beginning).</w:t>
+      </w:r>
+    </w:p>
+    <w:p>
+      <w:pPr>
+        <w:pStyle w:val="ListParagraph"/>
+        <w:numPr>
+          <w:ilvl w:val="0"/>
+          <w:numId w:val="7"/>
+        </w:numPr>
+        <w:rPr>
+          <w:rFonts w:ascii="David" w:hAnsi="David" w:cs="David"/>
+        </w:rPr>
+      </w:pPr>
+      <w:r>
+        <w:rPr>
+          <w:rFonts w:ascii="David" w:hAnsi="David" w:cs="David"/>
+        </w:rPr>
+        <w:t>The second rules determined special number between 1 – 10 (cleaned only those numbers from the dataset).</w:t>
+      </w:r>
+    </w:p>
+    <w:p>
+      <w:pPr>
+        <w:pStyle w:val="ListParagraph"/>
+        <w:numPr>
+          <w:ilvl w:val="0"/>
+          <w:numId w:val="7"/>
+        </w:numPr>
+        <w:rPr>
+          <w:rFonts w:ascii="David" w:hAnsi="David" w:cs="David"/>
+        </w:rPr>
+      </w:pPr>
+      <w:r>
+        <w:rPr>
+          <w:rFonts w:ascii="David" w:hAnsi="David" w:cs="David"/>
+        </w:rPr>
+        <w:t>The newest rules determined special number between 1 – 7.</w:t>
       </w:r>
     </w:p>
     <w:p>
@@ -1626,13 +1680,55 @@
         <w:rPr>
           <w:rFonts w:ascii="David" w:hAnsi="David" w:cs="David"/>
         </w:rPr>
-        <w:t xml:space="preserve"> - in the file. To put it here and to start analyze each one of them, maybe the export the graphs to csv for the AI model to train on that data, or only to give him the most common freqs of each ball.</w:t>
-      </w:r>
-      <w:r>
-        <w:rPr>
-          <w:rFonts w:ascii="David" w:hAnsi="David" w:cs="David"/>
-        </w:rPr>
-        <w:t xml:space="preserve"> Maybe to collide all the ffts together to one graph in order to see clearly the freq of each ball</w:t>
+        <w:t xml:space="preserve"> - in the file. To put it here and to start analyze each one of them, maybe the export the graphs to csv for the AI model to train on that data, or only to give him the most common </w:t>
+      </w:r>
+      <w:proofErr w:type="spellStart"/>
+      <w:r>
+        <w:rPr>
+          <w:rFonts w:ascii="David" w:hAnsi="David" w:cs="David"/>
+        </w:rPr>
+        <w:t>freqs</w:t>
+      </w:r>
+      <w:proofErr w:type="spellEnd"/>
+      <w:r>
+        <w:rPr>
+          <w:rFonts w:ascii="David" w:hAnsi="David" w:cs="David"/>
+        </w:rPr>
+        <w:t xml:space="preserve"> of each ball.</w:t>
+      </w:r>
+      <w:r>
+        <w:rPr>
+          <w:rFonts w:ascii="David" w:hAnsi="David" w:cs="David"/>
+        </w:rPr>
+        <w:t xml:space="preserve"> Maybe to collide all the </w:t>
+      </w:r>
+      <w:proofErr w:type="spellStart"/>
+      <w:r>
+        <w:rPr>
+          <w:rFonts w:ascii="David" w:hAnsi="David" w:cs="David"/>
+        </w:rPr>
+        <w:t>ffts</w:t>
+      </w:r>
+      <w:proofErr w:type="spellEnd"/>
+      <w:r>
+        <w:rPr>
+          <w:rFonts w:ascii="David" w:hAnsi="David" w:cs="David"/>
+        </w:rPr>
+        <w:t xml:space="preserve"> together to one graph in order to see clearly the </w:t>
+      </w:r>
+      <w:proofErr w:type="spellStart"/>
+      <w:r>
+        <w:rPr>
+          <w:rFonts w:ascii="David" w:hAnsi="David" w:cs="David"/>
+        </w:rPr>
+        <w:t>freq</w:t>
+      </w:r>
+      <w:proofErr w:type="spellEnd"/>
+      <w:r>
+        <w:rPr>
+          <w:rFonts w:ascii="David" w:hAnsi="David" w:cs="David"/>
+        </w:rPr>
+        <w:t xml:space="preserve"> of each ball</w:t>
       </w:r>
     </w:p>
     <w:p>
@@ -2072,6 +2168,95 @@
     </w:lvl>
   </w:abstractNum>
   <w:abstractNum w:abstractNumId="3" w15:restartNumberingAfterBreak="0">
+    <w:nsid w:val="2A0C51DE"/>
+    <w:multiLevelType w:val="hybridMultilevel"/>
+    <w:tmpl w:val="91E6B6EA"/>
+    <w:lvl w:ilvl="0" w:tplc="0409000F">
+      <w:start w:val="1"/>
+      <w:numFmt w:val="decimal"/>
+      <w:lvlText w:val="%1."/>
+      <w:lvlJc w:val="left"/>
+      <w:pPr>
+        <w:ind w:left="720" w:hanging="360"/>
+      </w:pPr>
+      <w:rPr>
+        <w:rFonts w:hint="default"/>
+      </w:rPr>
+    </w:lvl>
+    <w:lvl w:ilvl="1" w:tplc="04090019" w:tentative="1">
+      <w:start w:val="1"/>
+      <w:numFmt w:val="lowerLetter"/>
+      <w:lvlText w:val="%2."/>
+      <w:lvlJc w:val="left"/>
+      <w:pPr>
+        <w:ind w:left="1440" w:hanging="360"/>
+      </w:pPr>
+    </w:lvl>
+    <w:lvl w:ilvl="2" w:tplc="0409001B" w:tentative="1">
+      <w:start w:val="1"/>
+      <w:numFmt w:val="lowerRoman"/>
+      <w:lvlText w:val="%3."/>
+      <w:lvlJc w:val="right"/>
+      <w:pPr>
+        <w:ind w:left="2160" w:hanging="180"/>
+      </w:pPr>
+    </w:lvl>
+    <w:lvl w:ilvl="3" w:tplc="0409000F" w:tentative="1">
+      <w:start w:val="1"/>
+      <w:numFmt w:val="decimal"/>
+      <w:lvlText w:val="%4."/>
+      <w:lvlJc w:val="left"/>
+      <w:pPr>
+        <w:ind w:left="2880" w:hanging="360"/>
+      </w:pPr>
+    </w:lvl>
+    <w:lvl w:ilvl="4" w:tplc="04090019" w:tentative="1">
+      <w:start w:val="1"/>
+      <w:numFmt w:val="lowerLetter"/>
+      <w:lvlText w:val="%5."/>
+      <w:lvlJc w:val="left"/>
+      <w:pPr>
+        <w:ind w:left="3600" w:hanging="360"/>
+      </w:pPr>
+    </w:lvl>
+    <w:lvl w:ilvl="5" w:tplc="0409001B" w:tentative="1">
+      <w:start w:val="1"/>
+      <w:numFmt w:val="lowerRoman"/>
+      <w:lvlText w:val="%6."/>
+      <w:lvlJc w:val="right"/>
+      <w:pPr>
+        <w:ind w:left="4320" w:hanging="180"/>
+      </w:pPr>
+    </w:lvl>
+    <w:lvl w:ilvl="6" w:tplc="0409000F" w:tentative="1">
+      <w:start w:val="1"/>
+      <w:numFmt w:val="decimal"/>
+      <w:lvlText w:val="%7."/>
+      <w:lvlJc w:val="left"/>
+      <w:pPr>
+        <w:ind w:left="5040" w:hanging="360"/>
+      </w:pPr>
+    </w:lvl>
+    <w:lvl w:ilvl="7" w:tplc="04090019" w:tentative="1">
+      <w:start w:val="1"/>
+      <w:numFmt w:val="lowerLetter"/>
+      <w:lvlText w:val="%8."/>
+      <w:lvlJc w:val="left"/>
+      <w:pPr>
+        <w:ind w:left="5760" w:hanging="360"/>
+      </w:pPr>
+    </w:lvl>
+    <w:lvl w:ilvl="8" w:tplc="0409001B" w:tentative="1">
+      <w:start w:val="1"/>
+      <w:numFmt w:val="lowerRoman"/>
+      <w:lvlText w:val="%9."/>
+      <w:lvlJc w:val="right"/>
+      <w:pPr>
+        <w:ind w:left="6480" w:hanging="180"/>
+      </w:pPr>
+    </w:lvl>
+  </w:abstractNum>
+  <w:abstractNum w:abstractNumId="4" w15:restartNumberingAfterBreak="0">
     <w:nsid w:val="2A7927A1"/>
     <w:multiLevelType w:val="multilevel"/>
     <w:tmpl w:val="E6FA9384"/>
@@ -2184,7 +2369,7 @@
       </w:pPr>
     </w:lvl>
   </w:abstractNum>
-  <w:abstractNum w:abstractNumId="4" w15:restartNumberingAfterBreak="0">
+  <w:abstractNum w:abstractNumId="5" w15:restartNumberingAfterBreak="0">
     <w:nsid w:val="60060628"/>
     <w:multiLevelType w:val="hybridMultilevel"/>
     <w:tmpl w:val="FBD2718A"/>
@@ -2273,7 +2458,7 @@
       </w:pPr>
     </w:lvl>
   </w:abstractNum>
-  <w:abstractNum w:abstractNumId="5" w15:restartNumberingAfterBreak="0">
+  <w:abstractNum w:abstractNumId="6" w15:restartNumberingAfterBreak="0">
     <w:nsid w:val="60C11971"/>
     <w:multiLevelType w:val="multilevel"/>
     <w:tmpl w:val="6DFA7FA4"/>
@@ -2423,7 +2608,7 @@
     </w:lvl>
   </w:abstractNum>
   <w:num w:numId="1" w16cid:durableId="1697385529">
-    <w:abstractNumId w:val="3"/>
+    <w:abstractNumId w:val="4"/>
   </w:num>
   <w:num w:numId="2" w16cid:durableId="2030642752">
     <w:abstractNumId w:val="1"/>
@@ -2432,13 +2617,16 @@
     <w:abstractNumId w:val="0"/>
   </w:num>
   <w:num w:numId="4" w16cid:durableId="467357597">
-    <w:abstractNumId w:val="5"/>
+    <w:abstractNumId w:val="6"/>
   </w:num>
   <w:num w:numId="5" w16cid:durableId="829294110">
     <w:abstractNumId w:val="2"/>
   </w:num>
   <w:num w:numId="6" w16cid:durableId="1039933254">
-    <w:abstractNumId w:val="4"/>
+    <w:abstractNumId w:val="5"/>
+  </w:num>
+  <w:num w:numId="7" w16cid:durableId="576668524">
+    <w:abstractNumId w:val="3"/>
   </w:num>
 </w:numbering>
 </file>

</xml_diff>

<commit_message>
updating word and titles in csvs.
</commit_message>
<xml_diff>
--- a/Hitting the Jackpot.docx
+++ b/Hitting the Jackpot.docx
@@ -514,18 +514,17 @@
       </w:pPr>
       <w:r>
         <w:rPr>
-          <w:rFonts w:ascii="David" w:hAnsi="David" w:cs="David"/>
           <w:noProof/>
         </w:rPr>
         <w:lastRenderedPageBreak/>
         <w:drawing>
-          <wp:inline distT="0" distB="0" distL="0" distR="0" wp14:anchorId="6E1B0632" wp14:editId="3671EF2D">
-            <wp:extent cx="4099339" cy="2901384"/>
-            <wp:effectExtent l="0" t="0" r="15875" b="13335"/>
-            <wp:docPr id="955233371" name="Chart 1">
+          <wp:inline distT="0" distB="0" distL="0" distR="0" wp14:anchorId="22EEB05A" wp14:editId="7B19FD41">
+            <wp:extent cx="4572000" cy="2743200"/>
+            <wp:effectExtent l="0" t="0" r="0" b="0"/>
+            <wp:docPr id="1263423566" name="Chart 1">
               <a:extLst xmlns:a="http://schemas.openxmlformats.org/drawingml/2006/main">
                 <a:ext uri="{FF2B5EF4-FFF2-40B4-BE49-F238E27FC236}">
-                  <a16:creationId xmlns:a16="http://schemas.microsoft.com/office/drawing/2014/main" id="{95675A4D-8006-F224-2405-FFA5D576BD3E}"/>
+                  <a16:creationId xmlns:a16="http://schemas.microsoft.com/office/drawing/2014/main" id="{E0B39E75-CDEE-BF1E-5267-BCB2836650B4}"/>
                 </a:ext>
               </a:extLst>
             </wp:docPr>
@@ -1771,31 +1770,6 @@
           <w:rFonts w:ascii="David" w:hAnsi="David" w:cs="David"/>
         </w:rPr>
       </w:pPr>
-      <w:r>
-        <w:rPr>
-          <w:rFonts w:ascii="David" w:hAnsi="David" w:cs="David"/>
-          <w:noProof/>
-        </w:rPr>
-        <w:drawing>
-          <wp:inline distT="0" distB="0" distL="0" distR="0" wp14:anchorId="534421F9" wp14:editId="72C6F053">
-            <wp:extent cx="4113852" cy="2901384"/>
-            <wp:effectExtent l="0" t="0" r="1270" b="13335"/>
-            <wp:docPr id="1902137543" name="Chart 1">
-              <a:extLst xmlns:a="http://schemas.openxmlformats.org/drawingml/2006/main">
-                <a:ext uri="{FF2B5EF4-FFF2-40B4-BE49-F238E27FC236}">
-                  <a16:creationId xmlns:a16="http://schemas.microsoft.com/office/drawing/2014/main" id="{D9F4EE29-5E27-0CC9-20A5-81003919B8BC}"/>
-                </a:ext>
-              </a:extLst>
-            </wp:docPr>
-            <wp:cNvGraphicFramePr/>
-            <a:graphic xmlns:a="http://schemas.openxmlformats.org/drawingml/2006/main">
-              <a:graphicData uri="http://schemas.openxmlformats.org/drawingml/2006/chart">
-                <c:chart xmlns:c="http://schemas.openxmlformats.org/drawingml/2006/chart" xmlns:r="http://schemas.openxmlformats.org/officeDocument/2006/relationships" r:id="rId7"/>
-              </a:graphicData>
-            </a:graphic>
-          </wp:inline>
-        </w:drawing>
-      </w:r>
     </w:p>
     <w:p>
       <w:pPr>
@@ -3581,7 +3555,7 @@
           <a:bodyPr rot="0" spcFirstLastPara="1" vertOverflow="ellipsis" vert="horz" wrap="square" anchor="ctr" anchorCtr="1"/>
           <a:lstStyle/>
           <a:p>
-            <a:pPr algn="ctr">
+            <a:pPr>
               <a:defRPr sz="1400" b="0" i="0" u="none" strike="noStrike" kern="1200" spc="0" baseline="0">
                 <a:solidFill>
                   <a:schemeClr val="tx1">
@@ -3596,13 +3570,8 @@
             </a:pPr>
             <a:r>
               <a:rPr lang="en-US"/>
-              <a:t>Special</a:t>
+              <a:t>Special's number distributations</a:t>
             </a:r>
-            <a:r>
-              <a:rPr lang="en-US" baseline="0"/>
-              <a:t> number's distributation</a:t>
-            </a:r>
-            <a:endParaRPr lang="he-IL"/>
           </a:p>
         </c:rich>
       </c:tx>
@@ -3618,7 +3587,7 @@
         <a:bodyPr rot="0" spcFirstLastPara="1" vertOverflow="ellipsis" vert="horz" wrap="square" anchor="ctr" anchorCtr="1"/>
         <a:lstStyle/>
         <a:p>
-          <a:pPr algn="ctr">
+          <a:pPr>
             <a:defRPr sz="1400" b="0" i="0" u="none" strike="noStrike" kern="1200" spc="0" baseline="0">
               <a:solidFill>
                 <a:schemeClr val="tx1">
@@ -3631,7 +3600,7 @@
               <a:cs typeface="+mn-cs"/>
             </a:defRPr>
           </a:pPr>
-          <a:endParaRPr lang="he-IL"/>
+          <a:endParaRPr lang="en-US"/>
         </a:p>
       </c:txPr>
     </c:title>
@@ -3643,22 +3612,22 @@
         <c:grouping val="clustered"/>
         <c:varyColors val="0"/>
         <c:ser>
-          <c:idx val="0"/>
-          <c:order val="0"/>
+          <c:idx val="1"/>
+          <c:order val="1"/>
           <c:tx>
             <c:strRef>
-              <c:f>Distiributations!$H$1</c:f>
+              <c:f>Distiributations!$E$1</c:f>
               <c:strCache>
                 <c:ptCount val="1"/>
                 <c:pt idx="0">
-                  <c:v>המס' החזק</c:v>
+                  <c:v>special</c:v>
                 </c:pt>
               </c:strCache>
             </c:strRef>
           </c:tx>
           <c:spPr>
             <a:solidFill>
-              <a:schemeClr val="accent1"/>
+              <a:schemeClr val="accent2"/>
             </a:solidFill>
             <a:ln>
               <a:noFill/>
@@ -3668,37 +3637,37 @@
           <c:invertIfNegative val="0"/>
           <c:val>
             <c:numRef>
-              <c:f>Distiributations!$H$2:$H$8</c:f>
+              <c:f>Distiributations!$E$2:$E$8</c:f>
               <c:numCache>
                 <c:formatCode>General</c:formatCode>
                 <c:ptCount val="7"/>
                 <c:pt idx="0">
-                  <c:v>357</c:v>
+                  <c:v>313</c:v>
                 </c:pt>
                 <c:pt idx="1">
-                  <c:v>375</c:v>
+                  <c:v>318</c:v>
                 </c:pt>
                 <c:pt idx="2">
-                  <c:v>381</c:v>
+                  <c:v>337</c:v>
                 </c:pt>
                 <c:pt idx="3">
-                  <c:v>361</c:v>
+                  <c:v>311</c:v>
                 </c:pt>
                 <c:pt idx="4">
-                  <c:v>377</c:v>
+                  <c:v>331</c:v>
                 </c:pt>
                 <c:pt idx="5">
-                  <c:v>377</c:v>
+                  <c:v>325</c:v>
                 </c:pt>
                 <c:pt idx="6">
-                  <c:v>370</c:v>
+                  <c:v>322</c:v>
                 </c:pt>
               </c:numCache>
             </c:numRef>
           </c:val>
           <c:extLst>
             <c:ext xmlns:c16="http://schemas.microsoft.com/office/drawing/2014/chart" uri="{C3380CC4-5D6E-409C-BE32-E72D297353CC}">
-              <c16:uniqueId val="{00000000-6007-4AD0-B5D2-A5C512E19DCD}"/>
+              <c16:uniqueId val="{00000000-2F31-4A62-AB8C-E3769C07DBB5}"/>
             </c:ext>
           </c:extLst>
         </c:ser>
@@ -3712,11 +3681,89 @@
         </c:dLbls>
         <c:gapWidth val="219"/>
         <c:overlap val="-27"/>
-        <c:axId val="442831743"/>
-        <c:axId val="442825983"/>
+        <c:axId val="995124575"/>
+        <c:axId val="995108255"/>
+        <c:extLst>
+          <c:ext xmlns:c15="http://schemas.microsoft.com/office/drawing/2012/chart" uri="{02D57815-91ED-43cb-92C2-25804820EDAC}">
+            <c15:filteredBarSeries>
+              <c15:ser>
+                <c:idx val="0"/>
+                <c:order val="0"/>
+                <c:tx>
+                  <c:strRef>
+                    <c:extLst>
+                      <c:ext uri="{02D57815-91ED-43cb-92C2-25804820EDAC}">
+                        <c15:formulaRef>
+                          <c15:sqref>Distiributations!$D$1</c15:sqref>
+                        </c15:formulaRef>
+                      </c:ext>
+                    </c:extLst>
+                    <c:strCache>
+                      <c:ptCount val="1"/>
+                      <c:pt idx="0">
+                        <c:v>ball number</c:v>
+                      </c:pt>
+                    </c:strCache>
+                  </c:strRef>
+                </c:tx>
+                <c:spPr>
+                  <a:solidFill>
+                    <a:schemeClr val="accent1"/>
+                  </a:solidFill>
+                  <a:ln>
+                    <a:noFill/>
+                  </a:ln>
+                  <a:effectLst/>
+                </c:spPr>
+                <c:invertIfNegative val="0"/>
+                <c:val>
+                  <c:numRef>
+                    <c:extLst>
+                      <c:ext uri="{02D57815-91ED-43cb-92C2-25804820EDAC}">
+                        <c15:formulaRef>
+                          <c15:sqref>Distiributations!$D$2:$D$8</c15:sqref>
+                        </c15:formulaRef>
+                      </c:ext>
+                    </c:extLst>
+                    <c:numCache>
+                      <c:formatCode>General</c:formatCode>
+                      <c:ptCount val="7"/>
+                      <c:pt idx="0">
+                        <c:v>1</c:v>
+                      </c:pt>
+                      <c:pt idx="1">
+                        <c:v>2</c:v>
+                      </c:pt>
+                      <c:pt idx="2">
+                        <c:v>3</c:v>
+                      </c:pt>
+                      <c:pt idx="3">
+                        <c:v>4</c:v>
+                      </c:pt>
+                      <c:pt idx="4">
+                        <c:v>5</c:v>
+                      </c:pt>
+                      <c:pt idx="5">
+                        <c:v>6</c:v>
+                      </c:pt>
+                      <c:pt idx="6">
+                        <c:v>7</c:v>
+                      </c:pt>
+                    </c:numCache>
+                  </c:numRef>
+                </c:val>
+                <c:extLst>
+                  <c:ext xmlns:c16="http://schemas.microsoft.com/office/drawing/2014/chart" uri="{C3380CC4-5D6E-409C-BE32-E72D297353CC}">
+                    <c16:uniqueId val="{00000001-2F31-4A62-AB8C-E3769C07DBB5}"/>
+                  </c:ext>
+                </c:extLst>
+              </c15:ser>
+            </c15:filteredBarSeries>
+          </c:ext>
+        </c:extLst>
       </c:barChart>
       <c:catAx>
-        <c:axId val="442831743"/>
+        <c:axId val="995124575"/>
         <c:scaling>
           <c:orientation val="minMax"/>
         </c:scaling>
@@ -3755,10 +3802,10 @@
                 <a:cs typeface="+mn-cs"/>
               </a:defRPr>
             </a:pPr>
-            <a:endParaRPr lang="he-IL"/>
+            <a:endParaRPr lang="en-US"/>
           </a:p>
         </c:txPr>
-        <c:crossAx val="442825983"/>
+        <c:crossAx val="995108255"/>
         <c:crosses val="autoZero"/>
         <c:auto val="1"/>
         <c:lblAlgn val="ctr"/>
@@ -3766,7 +3813,7 @@
         <c:noMultiLvlLbl val="0"/>
       </c:catAx>
       <c:valAx>
-        <c:axId val="442825983"/>
+        <c:axId val="995108255"/>
         <c:scaling>
           <c:orientation val="minMax"/>
         </c:scaling>
@@ -3814,10 +3861,10 @@
                 <a:cs typeface="+mn-cs"/>
               </a:defRPr>
             </a:pPr>
-            <a:endParaRPr lang="he-IL"/>
+            <a:endParaRPr lang="en-US"/>
           </a:p>
         </c:txPr>
-        <c:crossAx val="442831743"/>
+        <c:crossAx val="995124575"/>
         <c:crosses val="autoZero"/>
         <c:crossBetween val="between"/>
       </c:valAx>
@@ -3829,6 +3876,37 @@
         <a:effectLst/>
       </c:spPr>
     </c:plotArea>
+    <c:legend>
+      <c:legendPos val="b"/>
+      <c:overlay val="0"/>
+      <c:spPr>
+        <a:noFill/>
+        <a:ln>
+          <a:noFill/>
+        </a:ln>
+        <a:effectLst/>
+      </c:spPr>
+      <c:txPr>
+        <a:bodyPr rot="0" spcFirstLastPara="1" vertOverflow="ellipsis" vert="horz" wrap="square" anchor="ctr" anchorCtr="1"/>
+        <a:lstStyle/>
+        <a:p>
+          <a:pPr>
+            <a:defRPr sz="900" b="0" i="0" u="none" strike="noStrike" kern="1200" baseline="0">
+              <a:solidFill>
+                <a:schemeClr val="tx1">
+                  <a:lumMod val="65000"/>
+                  <a:lumOff val="35000"/>
+                </a:schemeClr>
+              </a:solidFill>
+              <a:latin typeface="+mn-lt"/>
+              <a:ea typeface="+mn-ea"/>
+              <a:cs typeface="+mn-cs"/>
+            </a:defRPr>
+          </a:pPr>
+          <a:endParaRPr lang="en-US"/>
+        </a:p>
+      </c:txPr>
+    </c:legend>
     <c:plotVisOnly val="1"/>
     <c:dispBlanksAs val="gap"/>
     <c:showDLblsOverMax val="0"/>
@@ -3862,407 +3940,7 @@
       <a:pPr>
         <a:defRPr/>
       </a:pPr>
-      <a:endParaRPr lang="he-IL"/>
-    </a:p>
-  </c:txPr>
-  <c:externalData r:id="rId3">
-    <c:autoUpdate val="0"/>
-  </c:externalData>
-</c:chartSpace>
-</file>
-
-<file path=word/charts/chart2.xml><?xml version="1.0" encoding="utf-8"?>
-<c:chartSpace xmlns:c="http://schemas.openxmlformats.org/drawingml/2006/chart" xmlns:a="http://schemas.openxmlformats.org/drawingml/2006/main" xmlns:r="http://schemas.openxmlformats.org/officeDocument/2006/relationships" xmlns:c16r2="http://schemas.microsoft.com/office/drawing/2015/06/chart">
-  <c:date1904 val="0"/>
-  <c:lang val="en-US"/>
-  <c:roundedCorners val="0"/>
-  <mc:AlternateContent xmlns:mc="http://schemas.openxmlformats.org/markup-compatibility/2006">
-    <mc:Choice xmlns:c14="http://schemas.microsoft.com/office/drawing/2007/8/2/chart" Requires="c14">
-      <c14:style val="102"/>
-    </mc:Choice>
-    <mc:Fallback>
-      <c:style val="2"/>
-    </mc:Fallback>
-  </mc:AlternateContent>
-  <c:chart>
-    <c:title>
-      <c:tx>
-        <c:rich>
-          <a:bodyPr rot="0" spcFirstLastPara="1" vertOverflow="ellipsis" vert="horz" wrap="square" anchor="ctr" anchorCtr="1"/>
-          <a:lstStyle/>
-          <a:p>
-            <a:pPr>
-              <a:defRPr sz="1400" b="0" i="0" u="none" strike="noStrike" kern="1200" spc="0" baseline="0">
-                <a:solidFill>
-                  <a:schemeClr val="tx1">
-                    <a:lumMod val="65000"/>
-                    <a:lumOff val="35000"/>
-                  </a:schemeClr>
-                </a:solidFill>
-                <a:latin typeface="+mn-lt"/>
-                <a:ea typeface="+mn-ea"/>
-                <a:cs typeface="+mn-cs"/>
-              </a:defRPr>
-            </a:pPr>
-            <a:r>
-              <a:rPr lang="en-US"/>
-              <a:t>Normal</a:t>
-            </a:r>
-            <a:r>
-              <a:rPr lang="en-US" baseline="0"/>
-              <a:t> number's distributation</a:t>
-            </a:r>
-            <a:endParaRPr lang="he-IL"/>
-          </a:p>
-        </c:rich>
-      </c:tx>
-      <c:overlay val="0"/>
-      <c:spPr>
-        <a:noFill/>
-        <a:ln>
-          <a:noFill/>
-        </a:ln>
-        <a:effectLst/>
-      </c:spPr>
-      <c:txPr>
-        <a:bodyPr rot="0" spcFirstLastPara="1" vertOverflow="ellipsis" vert="horz" wrap="square" anchor="ctr" anchorCtr="1"/>
-        <a:lstStyle/>
-        <a:p>
-          <a:pPr>
-            <a:defRPr sz="1400" b="0" i="0" u="none" strike="noStrike" kern="1200" spc="0" baseline="0">
-              <a:solidFill>
-                <a:schemeClr val="tx1">
-                  <a:lumMod val="65000"/>
-                  <a:lumOff val="35000"/>
-                </a:schemeClr>
-              </a:solidFill>
-              <a:latin typeface="+mn-lt"/>
-              <a:ea typeface="+mn-ea"/>
-              <a:cs typeface="+mn-cs"/>
-            </a:defRPr>
-          </a:pPr>
-          <a:endParaRPr lang="he-IL"/>
-        </a:p>
-      </c:txPr>
-    </c:title>
-    <c:autoTitleDeleted val="0"/>
-    <c:plotArea>
-      <c:layout/>
-      <c:barChart>
-        <c:barDir val="col"/>
-        <c:grouping val="clustered"/>
-        <c:varyColors val="0"/>
-        <c:ser>
-          <c:idx val="0"/>
-          <c:order val="0"/>
-          <c:tx>
-            <c:strRef>
-              <c:f>Distiributations!$I$1</c:f>
-              <c:strCache>
-                <c:ptCount val="1"/>
-                <c:pt idx="0">
-                  <c:v>סיכטם המספרים 1 עד 6</c:v>
-                </c:pt>
-              </c:strCache>
-            </c:strRef>
-          </c:tx>
-          <c:spPr>
-            <a:solidFill>
-              <a:schemeClr val="accent1"/>
-            </a:solidFill>
-            <a:ln>
-              <a:noFill/>
-            </a:ln>
-            <a:effectLst/>
-          </c:spPr>
-          <c:invertIfNegative val="0"/>
-          <c:val>
-            <c:numRef>
-              <c:f>Distiributations!$I$2:$I$38</c:f>
-              <c:numCache>
-                <c:formatCode>General</c:formatCode>
-                <c:ptCount val="37"/>
-                <c:pt idx="0">
-                  <c:v>720</c:v>
-                </c:pt>
-                <c:pt idx="1">
-                  <c:v>725</c:v>
-                </c:pt>
-                <c:pt idx="2">
-                  <c:v>711</c:v>
-                </c:pt>
-                <c:pt idx="3">
-                  <c:v>665</c:v>
-                </c:pt>
-                <c:pt idx="4">
-                  <c:v>648</c:v>
-                </c:pt>
-                <c:pt idx="5">
-                  <c:v>717</c:v>
-                </c:pt>
-                <c:pt idx="6">
-                  <c:v>692</c:v>
-                </c:pt>
-                <c:pt idx="7">
-                  <c:v>744</c:v>
-                </c:pt>
-                <c:pt idx="8">
-                  <c:v>696</c:v>
-                </c:pt>
-                <c:pt idx="9">
-                  <c:v>706</c:v>
-                </c:pt>
-                <c:pt idx="10">
-                  <c:v>749</c:v>
-                </c:pt>
-                <c:pt idx="11">
-                  <c:v>718</c:v>
-                </c:pt>
-                <c:pt idx="12">
-                  <c:v>668</c:v>
-                </c:pt>
-                <c:pt idx="13">
-                  <c:v>655</c:v>
-                </c:pt>
-                <c:pt idx="14">
-                  <c:v>643</c:v>
-                </c:pt>
-                <c:pt idx="15">
-                  <c:v>677</c:v>
-                </c:pt>
-                <c:pt idx="16">
-                  <c:v>703</c:v>
-                </c:pt>
-                <c:pt idx="17">
-                  <c:v>664</c:v>
-                </c:pt>
-                <c:pt idx="18">
-                  <c:v>695</c:v>
-                </c:pt>
-                <c:pt idx="19">
-                  <c:v>720</c:v>
-                </c:pt>
-                <c:pt idx="20">
-                  <c:v>718</c:v>
-                </c:pt>
-                <c:pt idx="21">
-                  <c:v>706</c:v>
-                </c:pt>
-                <c:pt idx="22">
-                  <c:v>680</c:v>
-                </c:pt>
-                <c:pt idx="23">
-                  <c:v>694</c:v>
-                </c:pt>
-                <c:pt idx="24">
-                  <c:v>719</c:v>
-                </c:pt>
-                <c:pt idx="25">
-                  <c:v>714</c:v>
-                </c:pt>
-                <c:pt idx="26">
-                  <c:v>689</c:v>
-                </c:pt>
-                <c:pt idx="27">
-                  <c:v>692</c:v>
-                </c:pt>
-                <c:pt idx="28">
-                  <c:v>698</c:v>
-                </c:pt>
-                <c:pt idx="29">
-                  <c:v>697</c:v>
-                </c:pt>
-                <c:pt idx="30">
-                  <c:v>674</c:v>
-                </c:pt>
-                <c:pt idx="31">
-                  <c:v>671</c:v>
-                </c:pt>
-                <c:pt idx="32">
-                  <c:v>680</c:v>
-                </c:pt>
-                <c:pt idx="33">
-                  <c:v>689</c:v>
-                </c:pt>
-                <c:pt idx="34">
-                  <c:v>623</c:v>
-                </c:pt>
-                <c:pt idx="35">
-                  <c:v>569</c:v>
-                </c:pt>
-                <c:pt idx="36">
-                  <c:v>598</c:v>
-                </c:pt>
-              </c:numCache>
-            </c:numRef>
-          </c:val>
-          <c:extLst>
-            <c:ext xmlns:c16="http://schemas.microsoft.com/office/drawing/2014/chart" uri="{C3380CC4-5D6E-409C-BE32-E72D297353CC}">
-              <c16:uniqueId val="{00000000-3553-4345-A3DB-F88B288B7154}"/>
-            </c:ext>
-          </c:extLst>
-        </c:ser>
-        <c:dLbls>
-          <c:showLegendKey val="0"/>
-          <c:showVal val="0"/>
-          <c:showCatName val="0"/>
-          <c:showSerName val="0"/>
-          <c:showPercent val="0"/>
-          <c:showBubbleSize val="0"/>
-        </c:dLbls>
-        <c:gapWidth val="219"/>
-        <c:overlap val="-27"/>
-        <c:axId val="1550322304"/>
-        <c:axId val="1550329024"/>
-      </c:barChart>
-      <c:catAx>
-        <c:axId val="1550322304"/>
-        <c:scaling>
-          <c:orientation val="minMax"/>
-        </c:scaling>
-        <c:delete val="0"/>
-        <c:axPos val="b"/>
-        <c:majorTickMark val="none"/>
-        <c:minorTickMark val="none"/>
-        <c:tickLblPos val="nextTo"/>
-        <c:spPr>
-          <a:noFill/>
-          <a:ln w="9525" cap="flat" cmpd="sng" algn="ctr">
-            <a:solidFill>
-              <a:schemeClr val="tx1">
-                <a:lumMod val="15000"/>
-                <a:lumOff val="85000"/>
-              </a:schemeClr>
-            </a:solidFill>
-            <a:round/>
-          </a:ln>
-          <a:effectLst/>
-        </c:spPr>
-        <c:txPr>
-          <a:bodyPr rot="-60000000" spcFirstLastPara="1" vertOverflow="ellipsis" vert="horz" wrap="square" anchor="ctr" anchorCtr="1"/>
-          <a:lstStyle/>
-          <a:p>
-            <a:pPr>
-              <a:defRPr sz="900" b="0" i="0" u="none" strike="noStrike" kern="1200" baseline="0">
-                <a:solidFill>
-                  <a:schemeClr val="tx1">
-                    <a:lumMod val="65000"/>
-                    <a:lumOff val="35000"/>
-                  </a:schemeClr>
-                </a:solidFill>
-                <a:latin typeface="+mn-lt"/>
-                <a:ea typeface="+mn-ea"/>
-                <a:cs typeface="+mn-cs"/>
-              </a:defRPr>
-            </a:pPr>
-            <a:endParaRPr lang="he-IL"/>
-          </a:p>
-        </c:txPr>
-        <c:crossAx val="1550329024"/>
-        <c:crosses val="autoZero"/>
-        <c:auto val="1"/>
-        <c:lblAlgn val="ctr"/>
-        <c:lblOffset val="100"/>
-        <c:noMultiLvlLbl val="0"/>
-      </c:catAx>
-      <c:valAx>
-        <c:axId val="1550329024"/>
-        <c:scaling>
-          <c:orientation val="minMax"/>
-        </c:scaling>
-        <c:delete val="0"/>
-        <c:axPos val="l"/>
-        <c:majorGridlines>
-          <c:spPr>
-            <a:ln w="9525" cap="flat" cmpd="sng" algn="ctr">
-              <a:solidFill>
-                <a:schemeClr val="tx1">
-                  <a:lumMod val="15000"/>
-                  <a:lumOff val="85000"/>
-                </a:schemeClr>
-              </a:solidFill>
-              <a:round/>
-            </a:ln>
-            <a:effectLst/>
-          </c:spPr>
-        </c:majorGridlines>
-        <c:numFmt formatCode="General" sourceLinked="1"/>
-        <c:majorTickMark val="none"/>
-        <c:minorTickMark val="none"/>
-        <c:tickLblPos val="nextTo"/>
-        <c:spPr>
-          <a:noFill/>
-          <a:ln>
-            <a:noFill/>
-          </a:ln>
-          <a:effectLst/>
-        </c:spPr>
-        <c:txPr>
-          <a:bodyPr rot="-60000000" spcFirstLastPara="1" vertOverflow="ellipsis" vert="horz" wrap="square" anchor="ctr" anchorCtr="1"/>
-          <a:lstStyle/>
-          <a:p>
-            <a:pPr>
-              <a:defRPr sz="900" b="0" i="0" u="none" strike="noStrike" kern="1200" baseline="0">
-                <a:solidFill>
-                  <a:schemeClr val="tx1">
-                    <a:lumMod val="65000"/>
-                    <a:lumOff val="35000"/>
-                  </a:schemeClr>
-                </a:solidFill>
-                <a:latin typeface="+mn-lt"/>
-                <a:ea typeface="+mn-ea"/>
-                <a:cs typeface="+mn-cs"/>
-              </a:defRPr>
-            </a:pPr>
-            <a:endParaRPr lang="he-IL"/>
-          </a:p>
-        </c:txPr>
-        <c:crossAx val="1550322304"/>
-        <c:crosses val="autoZero"/>
-        <c:crossBetween val="between"/>
-      </c:valAx>
-      <c:spPr>
-        <a:noFill/>
-        <a:ln>
-          <a:noFill/>
-        </a:ln>
-        <a:effectLst/>
-      </c:spPr>
-    </c:plotArea>
-    <c:plotVisOnly val="1"/>
-    <c:dispBlanksAs val="gap"/>
-    <c:showDLblsOverMax val="0"/>
-    <c:extLst>
-      <c:ext xmlns:c16r3="http://schemas.microsoft.com/office/drawing/2017/03/chart" uri="{56B9EC1D-385E-4148-901F-78D8002777C0}">
-        <c16r3:dataDisplayOptions16>
-          <c16r3:dispNaAsBlank val="1"/>
-        </c16r3:dataDisplayOptions16>
-      </c:ext>
-    </c:extLst>
-  </c:chart>
-  <c:spPr>
-    <a:solidFill>
-      <a:schemeClr val="bg1"/>
-    </a:solidFill>
-    <a:ln w="9525" cap="flat" cmpd="sng" algn="ctr">
-      <a:solidFill>
-        <a:schemeClr val="tx1">
-          <a:lumMod val="15000"/>
-          <a:lumOff val="85000"/>
-        </a:schemeClr>
-      </a:solidFill>
-      <a:round/>
-    </a:ln>
-    <a:effectLst/>
-  </c:spPr>
-  <c:txPr>
-    <a:bodyPr/>
-    <a:lstStyle/>
-    <a:p>
-      <a:pPr>
-        <a:defRPr/>
-      </a:pPr>
-      <a:endParaRPr lang="he-IL"/>
+      <a:endParaRPr lang="en-US"/>
     </a:p>
   </c:txPr>
   <c:externalData r:id="rId3">
@@ -4311,550 +3989,7 @@
 </cs:colorStyle>
 </file>
 
-<file path=word/charts/colors2.xml><?xml version="1.0" encoding="utf-8"?>
-<cs:colorStyle xmlns:cs="http://schemas.microsoft.com/office/drawing/2012/chartStyle" xmlns:a="http://schemas.openxmlformats.org/drawingml/2006/main" meth="cycle" id="10">
-  <a:schemeClr val="accent1"/>
-  <a:schemeClr val="accent2"/>
-  <a:schemeClr val="accent3"/>
-  <a:schemeClr val="accent4"/>
-  <a:schemeClr val="accent5"/>
-  <a:schemeClr val="accent6"/>
-  <cs:variation/>
-  <cs:variation>
-    <a:lumMod val="60000"/>
-  </cs:variation>
-  <cs:variation>
-    <a:lumMod val="80000"/>
-    <a:lumOff val="20000"/>
-  </cs:variation>
-  <cs:variation>
-    <a:lumMod val="80000"/>
-  </cs:variation>
-  <cs:variation>
-    <a:lumMod val="60000"/>
-    <a:lumOff val="40000"/>
-  </cs:variation>
-  <cs:variation>
-    <a:lumMod val="50000"/>
-  </cs:variation>
-  <cs:variation>
-    <a:lumMod val="70000"/>
-    <a:lumOff val="30000"/>
-  </cs:variation>
-  <cs:variation>
-    <a:lumMod val="70000"/>
-  </cs:variation>
-  <cs:variation>
-    <a:lumMod val="50000"/>
-    <a:lumOff val="50000"/>
-  </cs:variation>
-</cs:colorStyle>
-</file>
-
 <file path=word/charts/style1.xml><?xml version="1.0" encoding="utf-8"?>
-<cs:chartStyle xmlns:cs="http://schemas.microsoft.com/office/drawing/2012/chartStyle" xmlns:a="http://schemas.openxmlformats.org/drawingml/2006/main" id="201">
-  <cs:axisTitle>
-    <cs:lnRef idx="0"/>
-    <cs:fillRef idx="0"/>
-    <cs:effectRef idx="0"/>
-    <cs:fontRef idx="minor">
-      <a:schemeClr val="tx1">
-        <a:lumMod val="65000"/>
-        <a:lumOff val="35000"/>
-      </a:schemeClr>
-    </cs:fontRef>
-    <cs:defRPr sz="1000" kern="1200"/>
-  </cs:axisTitle>
-  <cs:categoryAxis>
-    <cs:lnRef idx="0"/>
-    <cs:fillRef idx="0"/>
-    <cs:effectRef idx="0"/>
-    <cs:fontRef idx="minor">
-      <a:schemeClr val="tx1">
-        <a:lumMod val="65000"/>
-        <a:lumOff val="35000"/>
-      </a:schemeClr>
-    </cs:fontRef>
-    <cs:spPr>
-      <a:ln w="9525" cap="flat" cmpd="sng" algn="ctr">
-        <a:solidFill>
-          <a:schemeClr val="tx1">
-            <a:lumMod val="15000"/>
-            <a:lumOff val="85000"/>
-          </a:schemeClr>
-        </a:solidFill>
-        <a:round/>
-      </a:ln>
-    </cs:spPr>
-    <cs:defRPr sz="900" kern="1200"/>
-  </cs:categoryAxis>
-  <cs:chartArea mods="allowNoFillOverride allowNoLineOverride">
-    <cs:lnRef idx="0"/>
-    <cs:fillRef idx="0"/>
-    <cs:effectRef idx="0"/>
-    <cs:fontRef idx="minor">
-      <a:schemeClr val="tx1"/>
-    </cs:fontRef>
-    <cs:spPr>
-      <a:solidFill>
-        <a:schemeClr val="bg1"/>
-      </a:solidFill>
-      <a:ln w="9525" cap="flat" cmpd="sng" algn="ctr">
-        <a:solidFill>
-          <a:schemeClr val="tx1">
-            <a:lumMod val="15000"/>
-            <a:lumOff val="85000"/>
-          </a:schemeClr>
-        </a:solidFill>
-        <a:round/>
-      </a:ln>
-    </cs:spPr>
-    <cs:defRPr sz="1000" kern="1200"/>
-  </cs:chartArea>
-  <cs:dataLabel>
-    <cs:lnRef idx="0"/>
-    <cs:fillRef idx="0"/>
-    <cs:effectRef idx="0"/>
-    <cs:fontRef idx="minor">
-      <a:schemeClr val="tx1">
-        <a:lumMod val="75000"/>
-        <a:lumOff val="25000"/>
-      </a:schemeClr>
-    </cs:fontRef>
-    <cs:defRPr sz="900" kern="1200"/>
-  </cs:dataLabel>
-  <cs:dataLabelCallout>
-    <cs:lnRef idx="0"/>
-    <cs:fillRef idx="0"/>
-    <cs:effectRef idx="0"/>
-    <cs:fontRef idx="minor">
-      <a:schemeClr val="dk1">
-        <a:lumMod val="65000"/>
-        <a:lumOff val="35000"/>
-      </a:schemeClr>
-    </cs:fontRef>
-    <cs:spPr>
-      <a:solidFill>
-        <a:schemeClr val="lt1"/>
-      </a:solidFill>
-      <a:ln>
-        <a:solidFill>
-          <a:schemeClr val="dk1">
-            <a:lumMod val="25000"/>
-            <a:lumOff val="75000"/>
-          </a:schemeClr>
-        </a:solidFill>
-      </a:ln>
-    </cs:spPr>
-    <cs:defRPr sz="900" kern="1200"/>
-    <cs:bodyPr rot="0" spcFirstLastPara="1" vertOverflow="clip" horzOverflow="clip" vert="horz" wrap="square" lIns="36576" tIns="18288" rIns="36576" bIns="18288" anchor="ctr" anchorCtr="1">
-      <a:spAutoFit/>
-    </cs:bodyPr>
-  </cs:dataLabelCallout>
-  <cs:dataPoint>
-    <cs:lnRef idx="0"/>
-    <cs:fillRef idx="1">
-      <cs:styleClr val="auto"/>
-    </cs:fillRef>
-    <cs:effectRef idx="0"/>
-    <cs:fontRef idx="minor">
-      <a:schemeClr val="tx1"/>
-    </cs:fontRef>
-  </cs:dataPoint>
-  <cs:dataPoint3D>
-    <cs:lnRef idx="0"/>
-    <cs:fillRef idx="1">
-      <cs:styleClr val="auto"/>
-    </cs:fillRef>
-    <cs:effectRef idx="0"/>
-    <cs:fontRef idx="minor">
-      <a:schemeClr val="tx1"/>
-    </cs:fontRef>
-  </cs:dataPoint3D>
-  <cs:dataPointLine>
-    <cs:lnRef idx="0">
-      <cs:styleClr val="auto"/>
-    </cs:lnRef>
-    <cs:fillRef idx="1"/>
-    <cs:effectRef idx="0"/>
-    <cs:fontRef idx="minor">
-      <a:schemeClr val="tx1"/>
-    </cs:fontRef>
-    <cs:spPr>
-      <a:ln w="28575" cap="rnd">
-        <a:solidFill>
-          <a:schemeClr val="phClr"/>
-        </a:solidFill>
-        <a:round/>
-      </a:ln>
-    </cs:spPr>
-  </cs:dataPointLine>
-  <cs:dataPointMarker>
-    <cs:lnRef idx="0">
-      <cs:styleClr val="auto"/>
-    </cs:lnRef>
-    <cs:fillRef idx="1">
-      <cs:styleClr val="auto"/>
-    </cs:fillRef>
-    <cs:effectRef idx="0"/>
-    <cs:fontRef idx="minor">
-      <a:schemeClr val="tx1"/>
-    </cs:fontRef>
-    <cs:spPr>
-      <a:ln w="9525">
-        <a:solidFill>
-          <a:schemeClr val="phClr"/>
-        </a:solidFill>
-      </a:ln>
-    </cs:spPr>
-  </cs:dataPointMarker>
-  <cs:dataPointMarkerLayout symbol="circle" size="5"/>
-  <cs:dataPointWireframe>
-    <cs:lnRef idx="0">
-      <cs:styleClr val="auto"/>
-    </cs:lnRef>
-    <cs:fillRef idx="1"/>
-    <cs:effectRef idx="0"/>
-    <cs:fontRef idx="minor">
-      <a:schemeClr val="tx1"/>
-    </cs:fontRef>
-    <cs:spPr>
-      <a:ln w="9525" cap="rnd">
-        <a:solidFill>
-          <a:schemeClr val="phClr"/>
-        </a:solidFill>
-        <a:round/>
-      </a:ln>
-    </cs:spPr>
-  </cs:dataPointWireframe>
-  <cs:dataTable>
-    <cs:lnRef idx="0"/>
-    <cs:fillRef idx="0"/>
-    <cs:effectRef idx="0"/>
-    <cs:fontRef idx="minor">
-      <a:schemeClr val="tx1">
-        <a:lumMod val="65000"/>
-        <a:lumOff val="35000"/>
-      </a:schemeClr>
-    </cs:fontRef>
-    <cs:spPr>
-      <a:noFill/>
-      <a:ln w="9525" cap="flat" cmpd="sng" algn="ctr">
-        <a:solidFill>
-          <a:schemeClr val="tx1">
-            <a:lumMod val="15000"/>
-            <a:lumOff val="85000"/>
-          </a:schemeClr>
-        </a:solidFill>
-        <a:round/>
-      </a:ln>
-    </cs:spPr>
-    <cs:defRPr sz="900" kern="1200"/>
-  </cs:dataTable>
-  <cs:downBar>
-    <cs:lnRef idx="0"/>
-    <cs:fillRef idx="0"/>
-    <cs:effectRef idx="0"/>
-    <cs:fontRef idx="minor">
-      <a:schemeClr val="dk1"/>
-    </cs:fontRef>
-    <cs:spPr>
-      <a:solidFill>
-        <a:schemeClr val="dk1">
-          <a:lumMod val="65000"/>
-          <a:lumOff val="35000"/>
-        </a:schemeClr>
-      </a:solidFill>
-      <a:ln w="9525">
-        <a:solidFill>
-          <a:schemeClr val="tx1">
-            <a:lumMod val="65000"/>
-            <a:lumOff val="35000"/>
-          </a:schemeClr>
-        </a:solidFill>
-      </a:ln>
-    </cs:spPr>
-  </cs:downBar>
-  <cs:dropLine>
-    <cs:lnRef idx="0"/>
-    <cs:fillRef idx="0"/>
-    <cs:effectRef idx="0"/>
-    <cs:fontRef idx="minor">
-      <a:schemeClr val="tx1"/>
-    </cs:fontRef>
-    <cs:spPr>
-      <a:ln w="9525" cap="flat" cmpd="sng" algn="ctr">
-        <a:solidFill>
-          <a:schemeClr val="tx1">
-            <a:lumMod val="35000"/>
-            <a:lumOff val="65000"/>
-          </a:schemeClr>
-        </a:solidFill>
-        <a:round/>
-      </a:ln>
-    </cs:spPr>
-  </cs:dropLine>
-  <cs:errorBar>
-    <cs:lnRef idx="0"/>
-    <cs:fillRef idx="0"/>
-    <cs:effectRef idx="0"/>
-    <cs:fontRef idx="minor">
-      <a:schemeClr val="tx1"/>
-    </cs:fontRef>
-    <cs:spPr>
-      <a:ln w="9525" cap="flat" cmpd="sng" algn="ctr">
-        <a:solidFill>
-          <a:schemeClr val="tx1">
-            <a:lumMod val="65000"/>
-            <a:lumOff val="35000"/>
-          </a:schemeClr>
-        </a:solidFill>
-        <a:round/>
-      </a:ln>
-    </cs:spPr>
-  </cs:errorBar>
-  <cs:floor>
-    <cs:lnRef idx="0"/>
-    <cs:fillRef idx="0"/>
-    <cs:effectRef idx="0"/>
-    <cs:fontRef idx="minor">
-      <a:schemeClr val="tx1"/>
-    </cs:fontRef>
-    <cs:spPr>
-      <a:noFill/>
-      <a:ln>
-        <a:noFill/>
-      </a:ln>
-    </cs:spPr>
-  </cs:floor>
-  <cs:gridlineMajor>
-    <cs:lnRef idx="0"/>
-    <cs:fillRef idx="0"/>
-    <cs:effectRef idx="0"/>
-    <cs:fontRef idx="minor">
-      <a:schemeClr val="tx1"/>
-    </cs:fontRef>
-    <cs:spPr>
-      <a:ln w="9525" cap="flat" cmpd="sng" algn="ctr">
-        <a:solidFill>
-          <a:schemeClr val="tx1">
-            <a:lumMod val="15000"/>
-            <a:lumOff val="85000"/>
-          </a:schemeClr>
-        </a:solidFill>
-        <a:round/>
-      </a:ln>
-    </cs:spPr>
-  </cs:gridlineMajor>
-  <cs:gridlineMinor>
-    <cs:lnRef idx="0"/>
-    <cs:fillRef idx="0"/>
-    <cs:effectRef idx="0"/>
-    <cs:fontRef idx="minor">
-      <a:schemeClr val="tx1"/>
-    </cs:fontRef>
-    <cs:spPr>
-      <a:ln w="9525" cap="flat" cmpd="sng" algn="ctr">
-        <a:solidFill>
-          <a:schemeClr val="tx1">
-            <a:lumMod val="5000"/>
-            <a:lumOff val="95000"/>
-          </a:schemeClr>
-        </a:solidFill>
-        <a:round/>
-      </a:ln>
-    </cs:spPr>
-  </cs:gridlineMinor>
-  <cs:hiLoLine>
-    <cs:lnRef idx="0"/>
-    <cs:fillRef idx="0"/>
-    <cs:effectRef idx="0"/>
-    <cs:fontRef idx="minor">
-      <a:schemeClr val="tx1"/>
-    </cs:fontRef>
-    <cs:spPr>
-      <a:ln w="9525" cap="flat" cmpd="sng" algn="ctr">
-        <a:solidFill>
-          <a:schemeClr val="tx1">
-            <a:lumMod val="75000"/>
-            <a:lumOff val="25000"/>
-          </a:schemeClr>
-        </a:solidFill>
-        <a:round/>
-      </a:ln>
-    </cs:spPr>
-  </cs:hiLoLine>
-  <cs:leaderLine>
-    <cs:lnRef idx="0"/>
-    <cs:fillRef idx="0"/>
-    <cs:effectRef idx="0"/>
-    <cs:fontRef idx="minor">
-      <a:schemeClr val="tx1"/>
-    </cs:fontRef>
-    <cs:spPr>
-      <a:ln w="9525" cap="flat" cmpd="sng" algn="ctr">
-        <a:solidFill>
-          <a:schemeClr val="tx1">
-            <a:lumMod val="35000"/>
-            <a:lumOff val="65000"/>
-          </a:schemeClr>
-        </a:solidFill>
-        <a:round/>
-      </a:ln>
-    </cs:spPr>
-  </cs:leaderLine>
-  <cs:legend>
-    <cs:lnRef idx="0"/>
-    <cs:fillRef idx="0"/>
-    <cs:effectRef idx="0"/>
-    <cs:fontRef idx="minor">
-      <a:schemeClr val="tx1">
-        <a:lumMod val="65000"/>
-        <a:lumOff val="35000"/>
-      </a:schemeClr>
-    </cs:fontRef>
-    <cs:defRPr sz="900" kern="1200"/>
-  </cs:legend>
-  <cs:plotArea mods="allowNoFillOverride allowNoLineOverride">
-    <cs:lnRef idx="0"/>
-    <cs:fillRef idx="0"/>
-    <cs:effectRef idx="0"/>
-    <cs:fontRef idx="minor">
-      <a:schemeClr val="tx1"/>
-    </cs:fontRef>
-  </cs:plotArea>
-  <cs:plotArea3D mods="allowNoFillOverride allowNoLineOverride">
-    <cs:lnRef idx="0"/>
-    <cs:fillRef idx="0"/>
-    <cs:effectRef idx="0"/>
-    <cs:fontRef idx="minor">
-      <a:schemeClr val="tx1"/>
-    </cs:fontRef>
-  </cs:plotArea3D>
-  <cs:seriesAxis>
-    <cs:lnRef idx="0"/>
-    <cs:fillRef idx="0"/>
-    <cs:effectRef idx="0"/>
-    <cs:fontRef idx="minor">
-      <a:schemeClr val="tx1">
-        <a:lumMod val="65000"/>
-        <a:lumOff val="35000"/>
-      </a:schemeClr>
-    </cs:fontRef>
-    <cs:defRPr sz="900" kern="1200"/>
-  </cs:seriesAxis>
-  <cs:seriesLine>
-    <cs:lnRef idx="0"/>
-    <cs:fillRef idx="0"/>
-    <cs:effectRef idx="0"/>
-    <cs:fontRef idx="minor">
-      <a:schemeClr val="tx1"/>
-    </cs:fontRef>
-    <cs:spPr>
-      <a:ln w="9525" cap="flat" cmpd="sng" algn="ctr">
-        <a:solidFill>
-          <a:schemeClr val="tx1">
-            <a:lumMod val="35000"/>
-            <a:lumOff val="65000"/>
-          </a:schemeClr>
-        </a:solidFill>
-        <a:round/>
-      </a:ln>
-    </cs:spPr>
-  </cs:seriesLine>
-  <cs:title>
-    <cs:lnRef idx="0"/>
-    <cs:fillRef idx="0"/>
-    <cs:effectRef idx="0"/>
-    <cs:fontRef idx="minor">
-      <a:schemeClr val="tx1">
-        <a:lumMod val="65000"/>
-        <a:lumOff val="35000"/>
-      </a:schemeClr>
-    </cs:fontRef>
-    <cs:defRPr sz="1400" b="0" kern="1200" spc="0" baseline="0"/>
-  </cs:title>
-  <cs:trendline>
-    <cs:lnRef idx="0">
-      <cs:styleClr val="auto"/>
-    </cs:lnRef>
-    <cs:fillRef idx="0"/>
-    <cs:effectRef idx="0"/>
-    <cs:fontRef idx="minor">
-      <a:schemeClr val="tx1"/>
-    </cs:fontRef>
-    <cs:spPr>
-      <a:ln w="19050" cap="rnd">
-        <a:solidFill>
-          <a:schemeClr val="phClr"/>
-        </a:solidFill>
-        <a:prstDash val="sysDot"/>
-      </a:ln>
-    </cs:spPr>
-  </cs:trendline>
-  <cs:trendlineLabel>
-    <cs:lnRef idx="0"/>
-    <cs:fillRef idx="0"/>
-    <cs:effectRef idx="0"/>
-    <cs:fontRef idx="minor">
-      <a:schemeClr val="tx1">
-        <a:lumMod val="65000"/>
-        <a:lumOff val="35000"/>
-      </a:schemeClr>
-    </cs:fontRef>
-    <cs:defRPr sz="900" kern="1200"/>
-  </cs:trendlineLabel>
-  <cs:upBar>
-    <cs:lnRef idx="0"/>
-    <cs:fillRef idx="0"/>
-    <cs:effectRef idx="0"/>
-    <cs:fontRef idx="minor">
-      <a:schemeClr val="dk1"/>
-    </cs:fontRef>
-    <cs:spPr>
-      <a:solidFill>
-        <a:schemeClr val="lt1"/>
-      </a:solidFill>
-      <a:ln w="9525">
-        <a:solidFill>
-          <a:schemeClr val="tx1">
-            <a:lumMod val="15000"/>
-            <a:lumOff val="85000"/>
-          </a:schemeClr>
-        </a:solidFill>
-      </a:ln>
-    </cs:spPr>
-  </cs:upBar>
-  <cs:valueAxis>
-    <cs:lnRef idx="0"/>
-    <cs:fillRef idx="0"/>
-    <cs:effectRef idx="0"/>
-    <cs:fontRef idx="minor">
-      <a:schemeClr val="tx1">
-        <a:lumMod val="65000"/>
-        <a:lumOff val="35000"/>
-      </a:schemeClr>
-    </cs:fontRef>
-    <cs:defRPr sz="900" kern="1200"/>
-  </cs:valueAxis>
-  <cs:wall>
-    <cs:lnRef idx="0"/>
-    <cs:fillRef idx="0"/>
-    <cs:effectRef idx="0"/>
-    <cs:fontRef idx="minor">
-      <a:schemeClr val="tx1"/>
-    </cs:fontRef>
-    <cs:spPr>
-      <a:noFill/>
-      <a:ln>
-        <a:noFill/>
-      </a:ln>
-    </cs:spPr>
-  </cs:wall>
-</cs:chartStyle>
-</file>
-
-<file path=word/charts/style2.xml><?xml version="1.0" encoding="utf-8"?>
 <cs:chartStyle xmlns:cs="http://schemas.microsoft.com/office/drawing/2012/chartStyle" xmlns:a="http://schemas.openxmlformats.org/drawingml/2006/main" id="201">
   <cs:axisTitle>
     <cs:lnRef idx="0"/>

</xml_diff>

<commit_message>
updating .dock file + graphs
</commit_message>
<xml_diff>
--- a/Hitting the Jackpot.docx
+++ b/Hitting the Jackpot.docx
@@ -191,13 +191,28 @@
         </w:numPr>
         <w:rPr>
           <w:rFonts w:ascii="David" w:hAnsi="David" w:cs="David"/>
-        </w:rPr>
-      </w:pPr>
-      <w:r>
-        <w:rPr>
-          <w:rFonts w:ascii="David" w:hAnsi="David" w:cs="David"/>
+          <w:highlight w:val="yellow"/>
+        </w:rPr>
+      </w:pPr>
+      <w:r>
+        <w:rPr>
+          <w:rFonts w:ascii="David" w:hAnsi="David" w:cs="David"/>
+          <w:highlight w:val="yellow"/>
         </w:rPr>
         <w:t>The newest rules determined special number between 1 – 7.</w:t>
+      </w:r>
+      <w:r>
+        <w:rPr>
+          <w:rFonts w:ascii="David" w:hAnsi="David" w:cs="David"/>
+          <w:highlight w:val="yellow"/>
+        </w:rPr>
+        <w:t xml:space="preserve"> </w:t>
+      </w:r>
+      <w:r>
+        <w:rPr>
+          <w:rFonts w:ascii="David" w:hAnsi="David" w:cs="David"/>
+        </w:rPr>
+        <w:t>Those are the rules I refer to.</w:t>
       </w:r>
     </w:p>
     <w:p>
@@ -524,19 +539,27 @@
           <w:rFonts w:ascii="David" w:hAnsi="David" w:cs="David"/>
         </w:rPr>
       </w:pPr>
+    </w:p>
+    <w:p>
+      <w:pPr>
+        <w:rPr>
+          <w:rFonts w:ascii="David" w:hAnsi="David" w:cs="David"/>
+          <w:u w:val="single"/>
+        </w:rPr>
+      </w:pPr>
       <w:r>
         <w:rPr>
           <w:noProof/>
         </w:rPr>
         <w:lastRenderedPageBreak/>
         <w:drawing>
-          <wp:inline distT="0" distB="0" distL="0" distR="0" wp14:anchorId="22EEB05A" wp14:editId="7B19FD41">
+          <wp:inline distT="0" distB="0" distL="0" distR="0" wp14:anchorId="73995112" wp14:editId="0331F667">
             <wp:extent cx="4572000" cy="2743200"/>
             <wp:effectExtent l="0" t="0" r="0" b="0"/>
-            <wp:docPr id="1263423566" name="Chart 1">
+            <wp:docPr id="174170611" name="Chart 1">
               <a:extLst xmlns:a="http://schemas.openxmlformats.org/drawingml/2006/main">
                 <a:ext uri="{FF2B5EF4-FFF2-40B4-BE49-F238E27FC236}">
-                  <a16:creationId xmlns:a16="http://schemas.microsoft.com/office/drawing/2014/main" id="{E0B39E75-CDEE-BF1E-5267-BCB2836650B4}"/>
+                  <a16:creationId xmlns:a16="http://schemas.microsoft.com/office/drawing/2014/main" id="{807FE874-54E3-193F-B0B9-A86DEC83076E}"/>
                 </a:ext>
               </a:extLst>
             </wp:docPr>
@@ -548,6 +571,99 @@
             </a:graphic>
           </wp:inline>
         </w:drawing>
+      </w:r>
+    </w:p>
+    <w:p>
+      <w:pPr>
+        <w:rPr>
+          <w:rFonts w:ascii="David" w:hAnsi="David" w:cs="David"/>
+        </w:rPr>
+      </w:pPr>
+      <w:r>
+        <w:rPr>
+          <w:rFonts w:ascii="David" w:hAnsi="David" w:cs="David"/>
+        </w:rPr>
+        <w:t>According to</w:t>
+      </w:r>
+      <w:r>
+        <w:rPr>
+          <w:rFonts w:ascii="David" w:hAnsi="David" w:cs="David"/>
+        </w:rPr>
+        <w:t xml:space="preserve"> the diagram the following numbers are most common</w:t>
+      </w:r>
+      <w:r>
+        <w:rPr>
+          <w:rFonts w:ascii="David" w:hAnsi="David" w:cs="David"/>
+        </w:rPr>
+        <w:t>:</w:t>
+      </w:r>
+    </w:p>
+    <w:p>
+      <w:pPr>
+        <w:pStyle w:val="ListParagraph"/>
+        <w:numPr>
+          <w:ilvl w:val="0"/>
+          <w:numId w:val="8"/>
+        </w:numPr>
+        <w:rPr>
+          <w:rFonts w:ascii="David" w:hAnsi="David" w:cs="David"/>
+        </w:rPr>
+      </w:pPr>
+      <w:r>
+        <w:rPr>
+          <w:rFonts w:ascii="David" w:hAnsi="David" w:cs="David"/>
+        </w:rPr>
+        <w:t>6</w:t>
+      </w:r>
+    </w:p>
+    <w:p>
+      <w:pPr>
+        <w:pStyle w:val="ListParagraph"/>
+        <w:numPr>
+          <w:ilvl w:val="0"/>
+          <w:numId w:val="8"/>
+        </w:numPr>
+        <w:rPr>
+          <w:rFonts w:ascii="David" w:hAnsi="David" w:cs="David"/>
+        </w:rPr>
+      </w:pPr>
+      <w:r>
+        <w:rPr>
+          <w:rFonts w:ascii="David" w:hAnsi="David" w:cs="David"/>
+        </w:rPr>
+        <w:t>3</w:t>
+      </w:r>
+    </w:p>
+    <w:p>
+      <w:pPr>
+        <w:pStyle w:val="ListParagraph"/>
+        <w:numPr>
+          <w:ilvl w:val="0"/>
+          <w:numId w:val="8"/>
+        </w:numPr>
+        <w:rPr>
+          <w:rFonts w:ascii="David" w:hAnsi="David" w:cs="David"/>
+        </w:rPr>
+      </w:pPr>
+      <w:r>
+        <w:rPr>
+          <w:rFonts w:ascii="David" w:hAnsi="David" w:cs="David"/>
+        </w:rPr>
+        <w:t>5</w:t>
+      </w:r>
+    </w:p>
+    <w:p>
+      <w:pPr>
+        <w:rPr>
+          <w:rFonts w:ascii="David" w:hAnsi="David" w:cs="David"/>
+          <w:u w:val="single"/>
+        </w:rPr>
+      </w:pPr>
+      <w:r>
+        <w:rPr>
+          <w:rFonts w:ascii="David" w:hAnsi="David" w:cs="David"/>
+        </w:rPr>
+        <w:t>The other numbers are significant less common.</w:t>
       </w:r>
     </w:p>
     <w:p>
@@ -1213,6 +1329,7 @@
         <w:rPr>
           <w:rFonts w:ascii="David" w:hAnsi="David" w:cs="David"/>
         </w:rPr>
+        <w:lastRenderedPageBreak/>
         <w:t>Focus: We aren't interested in the fact that the average lottery number is, for example, 1. We are interested in the fluctuations</w:t>
       </w:r>
       <w:r>
@@ -1298,7 +1415,6 @@
         <w:rPr>
           <w:rFonts w:ascii="David" w:hAnsi="David" w:cs="David"/>
         </w:rPr>
-        <w:lastRenderedPageBreak/>
         <w:t>The DC (Mean): This is like the Carrier Signal (</w:t>
       </w:r>
       <m:oMath>
@@ -1870,7 +1986,7 @@
     <w:p>
       <w:pPr>
         <w:rPr>
-          <w:rFonts w:ascii="David" w:hAnsi="David" w:cs="David" w:hint="cs"/>
+          <w:rFonts w:ascii="David" w:hAnsi="David" w:cs="David"/>
           <w:rtl/>
         </w:rPr>
       </w:pPr>
@@ -2678,6 +2794,118 @@
       <w:rPr>
         <w:rFonts w:ascii="Wingdings" w:hAnsi="Wingdings" w:hint="default"/>
         <w:sz w:val="20"/>
+      </w:rPr>
+    </w:lvl>
+  </w:abstractNum>
+  <w:abstractNum w:abstractNumId="7" w15:restartNumberingAfterBreak="0">
+    <w:nsid w:val="7AD634F7"/>
+    <w:multiLevelType w:val="hybridMultilevel"/>
+    <w:tmpl w:val="B91C0ECA"/>
+    <w:lvl w:ilvl="0" w:tplc="43487B90">
+      <w:numFmt w:val="bullet"/>
+      <w:lvlText w:val="-"/>
+      <w:lvlJc w:val="left"/>
+      <w:pPr>
+        <w:ind w:left="720" w:hanging="360"/>
+      </w:pPr>
+      <w:rPr>
+        <w:rFonts w:ascii="David" w:eastAsiaTheme="minorHAnsi" w:hAnsi="David" w:cs="David" w:hint="default"/>
+      </w:rPr>
+    </w:lvl>
+    <w:lvl w:ilvl="1" w:tplc="04090003" w:tentative="1">
+      <w:start w:val="1"/>
+      <w:numFmt w:val="bullet"/>
+      <w:lvlText w:val="o"/>
+      <w:lvlJc w:val="left"/>
+      <w:pPr>
+        <w:ind w:left="1440" w:hanging="360"/>
+      </w:pPr>
+      <w:rPr>
+        <w:rFonts w:ascii="Courier New" w:hAnsi="Courier New" w:cs="Courier New" w:hint="default"/>
+      </w:rPr>
+    </w:lvl>
+    <w:lvl w:ilvl="2" w:tplc="04090005" w:tentative="1">
+      <w:start w:val="1"/>
+      <w:numFmt w:val="bullet"/>
+      <w:lvlText w:val=""/>
+      <w:lvlJc w:val="left"/>
+      <w:pPr>
+        <w:ind w:left="2160" w:hanging="360"/>
+      </w:pPr>
+      <w:rPr>
+        <w:rFonts w:ascii="Wingdings" w:hAnsi="Wingdings" w:hint="default"/>
+      </w:rPr>
+    </w:lvl>
+    <w:lvl w:ilvl="3" w:tplc="04090001" w:tentative="1">
+      <w:start w:val="1"/>
+      <w:numFmt w:val="bullet"/>
+      <w:lvlText w:val=""/>
+      <w:lvlJc w:val="left"/>
+      <w:pPr>
+        <w:ind w:left="2880" w:hanging="360"/>
+      </w:pPr>
+      <w:rPr>
+        <w:rFonts w:ascii="Symbol" w:hAnsi="Symbol" w:hint="default"/>
+      </w:rPr>
+    </w:lvl>
+    <w:lvl w:ilvl="4" w:tplc="04090003" w:tentative="1">
+      <w:start w:val="1"/>
+      <w:numFmt w:val="bullet"/>
+      <w:lvlText w:val="o"/>
+      <w:lvlJc w:val="left"/>
+      <w:pPr>
+        <w:ind w:left="3600" w:hanging="360"/>
+      </w:pPr>
+      <w:rPr>
+        <w:rFonts w:ascii="Courier New" w:hAnsi="Courier New" w:cs="Courier New" w:hint="default"/>
+      </w:rPr>
+    </w:lvl>
+    <w:lvl w:ilvl="5" w:tplc="04090005" w:tentative="1">
+      <w:start w:val="1"/>
+      <w:numFmt w:val="bullet"/>
+      <w:lvlText w:val=""/>
+      <w:lvlJc w:val="left"/>
+      <w:pPr>
+        <w:ind w:left="4320" w:hanging="360"/>
+      </w:pPr>
+      <w:rPr>
+        <w:rFonts w:ascii="Wingdings" w:hAnsi="Wingdings" w:hint="default"/>
+      </w:rPr>
+    </w:lvl>
+    <w:lvl w:ilvl="6" w:tplc="04090001" w:tentative="1">
+      <w:start w:val="1"/>
+      <w:numFmt w:val="bullet"/>
+      <w:lvlText w:val=""/>
+      <w:lvlJc w:val="left"/>
+      <w:pPr>
+        <w:ind w:left="5040" w:hanging="360"/>
+      </w:pPr>
+      <w:rPr>
+        <w:rFonts w:ascii="Symbol" w:hAnsi="Symbol" w:hint="default"/>
+      </w:rPr>
+    </w:lvl>
+    <w:lvl w:ilvl="7" w:tplc="04090003" w:tentative="1">
+      <w:start w:val="1"/>
+      <w:numFmt w:val="bullet"/>
+      <w:lvlText w:val="o"/>
+      <w:lvlJc w:val="left"/>
+      <w:pPr>
+        <w:ind w:left="5760" w:hanging="360"/>
+      </w:pPr>
+      <w:rPr>
+        <w:rFonts w:ascii="Courier New" w:hAnsi="Courier New" w:cs="Courier New" w:hint="default"/>
+      </w:rPr>
+    </w:lvl>
+    <w:lvl w:ilvl="8" w:tplc="04090005" w:tentative="1">
+      <w:start w:val="1"/>
+      <w:numFmt w:val="bullet"/>
+      <w:lvlText w:val=""/>
+      <w:lvlJc w:val="left"/>
+      <w:pPr>
+        <w:ind w:left="6480" w:hanging="360"/>
+      </w:pPr>
+      <w:rPr>
+        <w:rFonts w:ascii="Wingdings" w:hAnsi="Wingdings" w:hint="default"/>
       </w:rPr>
     </w:lvl>
   </w:abstractNum>
@@ -2701,6 +2929,9 @@
   </w:num>
   <w:num w:numId="7" w16cid:durableId="576668524">
     <w:abstractNumId w:val="3"/>
+  </w:num>
+  <w:num w:numId="8" w16cid:durableId="1677927787">
+    <w:abstractNumId w:val="7"/>
   </w:num>
 </w:numbering>
 </file>
@@ -3670,7 +3901,7 @@
             </a:pPr>
             <a:r>
               <a:rPr lang="en-US"/>
-              <a:t>Special's number distributations</a:t>
+              <a:t>Special's number distribution</a:t>
             </a:r>
           </a:p>
         </c:rich>
@@ -3716,11 +3947,11 @@
           <c:order val="1"/>
           <c:tx>
             <c:strRef>
-              <c:f>Distiributations!$E$1</c:f>
+              <c:f>Distributions!$E$1</c:f>
               <c:strCache>
                 <c:ptCount val="1"/>
                 <c:pt idx="0">
-                  <c:v>special</c:v>
+                  <c:v>special number</c:v>
                 </c:pt>
               </c:strCache>
             </c:strRef>
@@ -3737,37 +3968,37 @@
           <c:invertIfNegative val="0"/>
           <c:val>
             <c:numRef>
-              <c:f>Distiributations!$E$2:$E$8</c:f>
+              <c:f>Distributions!$E$2:$E$8</c:f>
               <c:numCache>
                 <c:formatCode>General</c:formatCode>
                 <c:ptCount val="7"/>
                 <c:pt idx="0">
-                  <c:v>313</c:v>
+                  <c:v>236</c:v>
                 </c:pt>
                 <c:pt idx="1">
-                  <c:v>318</c:v>
+                  <c:v>236</c:v>
                 </c:pt>
                 <c:pt idx="2">
-                  <c:v>337</c:v>
+                  <c:v>251</c:v>
                 </c:pt>
                 <c:pt idx="3">
-                  <c:v>311</c:v>
+                  <c:v>225</c:v>
                 </c:pt>
                 <c:pt idx="4">
-                  <c:v>331</c:v>
+                  <c:v>247</c:v>
                 </c:pt>
                 <c:pt idx="5">
-                  <c:v>325</c:v>
+                  <c:v>254</c:v>
                 </c:pt>
                 <c:pt idx="6">
-                  <c:v>322</c:v>
+                  <c:v>232</c:v>
                 </c:pt>
               </c:numCache>
             </c:numRef>
           </c:val>
           <c:extLst>
             <c:ext xmlns:c16="http://schemas.microsoft.com/office/drawing/2014/chart" uri="{C3380CC4-5D6E-409C-BE32-E72D297353CC}">
-              <c16:uniqueId val="{00000000-2F31-4A62-AB8C-E3769C07DBB5}"/>
+              <c16:uniqueId val="{00000000-49E1-4BD5-85B7-54ACA3F4D7C0}"/>
             </c:ext>
           </c:extLst>
         </c:ser>
@@ -3781,8 +4012,8 @@
         </c:dLbls>
         <c:gapWidth val="219"/>
         <c:overlap val="-27"/>
-        <c:axId val="995124575"/>
-        <c:axId val="995108255"/>
+        <c:axId val="1312167616"/>
+        <c:axId val="1312569712"/>
         <c:extLst>
           <c:ext xmlns:c15="http://schemas.microsoft.com/office/drawing/2012/chart" uri="{02D57815-91ED-43cb-92C2-25804820EDAC}">
             <c15:filteredBarSeries>
@@ -3794,14 +4025,14 @@
                     <c:extLst>
                       <c:ext uri="{02D57815-91ED-43cb-92C2-25804820EDAC}">
                         <c15:formulaRef>
-                          <c15:sqref>Distiributations!$D$1</c15:sqref>
+                          <c15:sqref>Distributions!$D$1</c15:sqref>
                         </c15:formulaRef>
                       </c:ext>
                     </c:extLst>
                     <c:strCache>
                       <c:ptCount val="1"/>
                       <c:pt idx="0">
-                        <c:v>ball number</c:v>
+                        <c:v>ball nuber</c:v>
                       </c:pt>
                     </c:strCache>
                   </c:strRef>
@@ -3821,7 +4052,7 @@
                     <c:extLst>
                       <c:ext uri="{02D57815-91ED-43cb-92C2-25804820EDAC}">
                         <c15:formulaRef>
-                          <c15:sqref>Distiributations!$D$2:$D$8</c15:sqref>
+                          <c15:sqref>Distributions!$D$2:$D$8</c15:sqref>
                         </c15:formulaRef>
                       </c:ext>
                     </c:extLst>
@@ -3854,7 +4085,7 @@
                 </c:val>
                 <c:extLst>
                   <c:ext xmlns:c16="http://schemas.microsoft.com/office/drawing/2014/chart" uri="{C3380CC4-5D6E-409C-BE32-E72D297353CC}">
-                    <c16:uniqueId val="{00000001-2F31-4A62-AB8C-E3769C07DBB5}"/>
+                    <c16:uniqueId val="{00000001-49E1-4BD5-85B7-54ACA3F4D7C0}"/>
                   </c:ext>
                 </c:extLst>
               </c15:ser>
@@ -3863,7 +4094,7 @@
         </c:extLst>
       </c:barChart>
       <c:catAx>
-        <c:axId val="995124575"/>
+        <c:axId val="1312167616"/>
         <c:scaling>
           <c:orientation val="minMax"/>
         </c:scaling>
@@ -3905,7 +4136,7 @@
             <a:endParaRPr lang="en-US"/>
           </a:p>
         </c:txPr>
-        <c:crossAx val="995108255"/>
+        <c:crossAx val="1312569712"/>
         <c:crosses val="autoZero"/>
         <c:auto val="1"/>
         <c:lblAlgn val="ctr"/>
@@ -3913,7 +4144,7 @@
         <c:noMultiLvlLbl val="0"/>
       </c:catAx>
       <c:valAx>
-        <c:axId val="995108255"/>
+        <c:axId val="1312569712"/>
         <c:scaling>
           <c:orientation val="minMax"/>
         </c:scaling>
@@ -3964,7 +4195,7 @@
             <a:endParaRPr lang="en-US"/>
           </a:p>
         </c:txPr>
-        <c:crossAx val="995124575"/>
+        <c:crossAx val="1312167616"/>
         <c:crosses val="autoZero"/>
         <c:crossBetween val="between"/>
       </c:valAx>

</xml_diff>

<commit_message>
documenting in the text book.
</commit_message>
<xml_diff>
--- a/Hitting the Jackpot.docx
+++ b/Hitting the Jackpot.docx
@@ -510,6 +510,7 @@
     </w:p>
     <w:p>
       <w:pPr>
+        <w:ind w:left="720"/>
         <w:rPr>
           <w:rFonts w:ascii="David" w:hAnsi="David" w:cs="David"/>
         </w:rPr>
@@ -535,13 +536,15 @@
     </w:p>
     <w:p>
       <w:pPr>
-        <w:rPr>
-          <w:rFonts w:ascii="David" w:hAnsi="David" w:cs="David"/>
-        </w:rPr>
-      </w:pPr>
-    </w:p>
-    <w:p>
-      <w:pPr>
+        <w:ind w:left="720"/>
+        <w:rPr>
+          <w:rFonts w:ascii="David" w:hAnsi="David" w:cs="David"/>
+        </w:rPr>
+      </w:pPr>
+    </w:p>
+    <w:p>
+      <w:pPr>
+        <w:ind w:left="720"/>
         <w:rPr>
           <w:rFonts w:ascii="David" w:hAnsi="David" w:cs="David"/>
           <w:u w:val="single"/>
@@ -575,6 +578,7 @@
     </w:p>
     <w:p>
       <w:pPr>
+        <w:ind w:left="720"/>
         <w:rPr>
           <w:rFonts w:ascii="David" w:hAnsi="David" w:cs="David"/>
         </w:rPr>
@@ -605,6 +609,7 @@
           <w:ilvl w:val="0"/>
           <w:numId w:val="8"/>
         </w:numPr>
+        <w:ind w:left="1440"/>
         <w:rPr>
           <w:rFonts w:ascii="David" w:hAnsi="David" w:cs="David"/>
         </w:rPr>
@@ -623,6 +628,7 @@
           <w:ilvl w:val="0"/>
           <w:numId w:val="8"/>
         </w:numPr>
+        <w:ind w:left="1440"/>
         <w:rPr>
           <w:rFonts w:ascii="David" w:hAnsi="David" w:cs="David"/>
         </w:rPr>
@@ -641,6 +647,7 @@
           <w:ilvl w:val="0"/>
           <w:numId w:val="8"/>
         </w:numPr>
+        <w:ind w:left="1440"/>
         <w:rPr>
           <w:rFonts w:ascii="David" w:hAnsi="David" w:cs="David"/>
         </w:rPr>
@@ -654,6 +661,7 @@
     </w:p>
     <w:p>
       <w:pPr>
+        <w:ind w:left="720"/>
         <w:rPr>
           <w:rFonts w:ascii="David" w:hAnsi="David" w:cs="David"/>
           <w:u w:val="single"/>
@@ -663,7 +671,21 @@
         <w:rPr>
           <w:rFonts w:ascii="David" w:hAnsi="David" w:cs="David"/>
         </w:rPr>
-        <w:t>The other numbers are significant less common.</w:t>
+        <w:t xml:space="preserve">The other numbers are </w:t>
+      </w:r>
+      <w:proofErr w:type="gramStart"/>
+      <w:r>
+        <w:rPr>
+          <w:rFonts w:ascii="David" w:hAnsi="David" w:cs="David"/>
+        </w:rPr>
+        <w:t>significant</w:t>
+      </w:r>
+      <w:proofErr w:type="gramEnd"/>
+      <w:r>
+        <w:rPr>
+          <w:rFonts w:ascii="David" w:hAnsi="David" w:cs="David"/>
+        </w:rPr>
+        <w:t xml:space="preserve"> less common.</w:t>
       </w:r>
     </w:p>
     <w:p>
@@ -705,16 +727,18 @@
       <w:pPr>
         <w:pStyle w:val="ListParagraph"/>
         <w:numPr>
-          <w:ilvl w:val="0"/>
-          <w:numId w:val="6"/>
+          <w:ilvl w:val="1"/>
+          <w:numId w:val="5"/>
         </w:numPr>
         <w:rPr>
           <w:rFonts w:ascii="David" w:hAnsi="David" w:cs="David"/>
-        </w:rPr>
-      </w:pPr>
-      <w:r>
-        <w:rPr>
-          <w:rFonts w:ascii="David" w:hAnsi="David" w:cs="David"/>
+          <w:u w:val="single"/>
+        </w:rPr>
+      </w:pPr>
+      <w:r>
+        <w:rPr>
+          <w:rFonts w:ascii="David" w:hAnsi="David" w:cs="David"/>
+          <w:u w:val="single"/>
         </w:rPr>
         <w:t>FFT</w:t>
       </w:r>
@@ -728,6 +752,7 @@
     <w:p>
       <w:pPr>
         <w:pStyle w:val="ListParagraph"/>
+        <w:ind w:left="1440"/>
         <w:rPr>
           <w:rFonts w:ascii="David" w:hAnsi="David" w:cs="David"/>
         </w:rPr>
@@ -741,7 +766,7 @@
     </w:p>
     <w:p>
       <w:pPr>
-        <w:ind w:left="360"/>
+        <w:ind w:left="1080"/>
         <w:rPr>
           <w:rFonts w:ascii="David" w:hAnsi="David" w:cs="David"/>
         </w:rPr>
@@ -917,7 +942,7 @@
     </w:p>
     <w:p>
       <w:pPr>
-        <w:ind w:left="360"/>
+        <w:ind w:left="1080"/>
         <w:rPr>
           <w:rFonts w:ascii="David" w:hAnsi="David" w:cs="David"/>
         </w:rPr>
@@ -971,7 +996,7 @@
     </w:p>
     <w:p>
       <w:pPr>
-        <w:ind w:left="360"/>
+        <w:ind w:left="1080"/>
         <w:rPr>
           <w:rFonts w:ascii="David" w:hAnsi="David" w:cs="David"/>
         </w:rPr>
@@ -1063,7 +1088,7 @@
     </w:p>
     <w:p>
       <w:pPr>
-        <w:ind w:left="360"/>
+        <w:ind w:left="1080"/>
         <w:rPr>
           <w:rFonts w:ascii="David" w:hAnsi="David" w:cs="David"/>
         </w:rPr>
@@ -1074,11 +1099,19 @@
         </w:rPr>
         <w:t xml:space="preserve">This means </w:t>
       </w:r>
-      <w:r>
-        <w:rPr>
-          <w:rFonts w:ascii="David" w:hAnsi="David" w:cs="David"/>
-        </w:rPr>
-        <w:t>X[0</w:t>
+      <w:proofErr w:type="gramStart"/>
+      <w:r>
+        <w:rPr>
+          <w:rFonts w:ascii="David" w:hAnsi="David" w:cs="David"/>
+        </w:rPr>
+        <w:t>X[</w:t>
+      </w:r>
+      <w:proofErr w:type="gramEnd"/>
+      <w:r>
+        <w:rPr>
+          <w:rFonts w:ascii="David" w:hAnsi="David" w:cs="David"/>
+        </w:rPr>
+        <w:t>0</w:t>
       </w:r>
       <w:r>
         <w:rPr>
@@ -1123,7 +1156,7 @@
     </w:p>
     <w:p>
       <w:pPr>
-        <w:ind w:left="360"/>
+        <w:ind w:left="1080"/>
         <w:rPr>
           <w:rFonts w:ascii="David" w:hAnsi="David" w:cs="David"/>
         </w:rPr>
@@ -1209,7 +1242,7 @@
     </w:p>
     <w:p>
       <w:pPr>
-        <w:ind w:left="360"/>
+        <w:ind w:left="1080"/>
         <w:rPr>
           <w:rFonts w:ascii="David" w:hAnsi="David" w:cs="David"/>
         </w:rPr>
@@ -1237,7 +1270,7 @@
     </w:p>
     <w:p>
       <w:pPr>
-        <w:ind w:left="360"/>
+        <w:ind w:left="1080"/>
         <w:rPr>
           <w:rFonts w:ascii="David" w:hAnsi="David" w:cs="David"/>
           <w:rtl/>
@@ -1252,7 +1285,7 @@
     </w:p>
     <w:p>
       <w:pPr>
-        <w:ind w:left="360"/>
+        <w:ind w:left="1080"/>
         <w:rPr>
           <w:rFonts w:ascii="David" w:hAnsi="David" w:cs="David"/>
         </w:rPr>
@@ -1272,9 +1305,9 @@
         </w:numPr>
         <w:tabs>
           <w:tab w:val="clear" w:pos="720"/>
-          <w:tab w:val="num" w:pos="1080"/>
+          <w:tab w:val="num" w:pos="1800"/>
         </w:tabs>
-        <w:ind w:left="1080"/>
+        <w:ind w:left="1800"/>
         <w:rPr>
           <w:rFonts w:ascii="David" w:hAnsi="David" w:cs="David"/>
         </w:rPr>
@@ -1318,9 +1351,9 @@
         </w:numPr>
         <w:tabs>
           <w:tab w:val="clear" w:pos="720"/>
-          <w:tab w:val="num" w:pos="1080"/>
+          <w:tab w:val="num" w:pos="1800"/>
         </w:tabs>
-        <w:ind w:left="1080"/>
+        <w:ind w:left="1800"/>
         <w:rPr>
           <w:rFonts w:ascii="David" w:hAnsi="David" w:cs="David"/>
         </w:rPr>
@@ -1362,29 +1395,32 @@
       <w:pPr>
         <w:pStyle w:val="ListParagraph"/>
         <w:numPr>
-          <w:ilvl w:val="0"/>
-          <w:numId w:val="6"/>
+          <w:ilvl w:val="1"/>
+          <w:numId w:val="5"/>
         </w:numPr>
         <w:rPr>
           <w:rFonts w:ascii="David" w:hAnsi="David" w:cs="David"/>
-        </w:rPr>
-      </w:pPr>
-      <w:r>
-        <w:rPr>
-          <w:rFonts w:ascii="David" w:hAnsi="David" w:cs="David"/>
+          <w:u w:val="single"/>
+        </w:rPr>
+      </w:pPr>
+      <w:r>
+        <w:rPr>
+          <w:rFonts w:ascii="David" w:hAnsi="David" w:cs="David"/>
+          <w:u w:val="single"/>
         </w:rPr>
         <w:t>The Communication Analogy</w:t>
       </w:r>
       <w:r>
         <w:rPr>
           <w:rFonts w:ascii="David" w:hAnsi="David" w:cs="David"/>
+          <w:u w:val="single"/>
         </w:rPr>
         <w:t>:</w:t>
       </w:r>
     </w:p>
     <w:p>
       <w:pPr>
-        <w:ind w:left="360"/>
+        <w:ind w:left="1080"/>
         <w:rPr>
           <w:rFonts w:ascii="David" w:hAnsi="David" w:cs="David"/>
         </w:rPr>
@@ -1404,9 +1440,9 @@
         </w:numPr>
         <w:tabs>
           <w:tab w:val="clear" w:pos="720"/>
-          <w:tab w:val="num" w:pos="1080"/>
+          <w:tab w:val="num" w:pos="1800"/>
         </w:tabs>
-        <w:ind w:left="1080"/>
+        <w:ind w:left="1800"/>
         <w:rPr>
           <w:rFonts w:ascii="David" w:hAnsi="David" w:cs="David"/>
         </w:rPr>
@@ -1460,9 +1496,9 @@
         </w:numPr>
         <w:tabs>
           <w:tab w:val="clear" w:pos="720"/>
-          <w:tab w:val="num" w:pos="1080"/>
+          <w:tab w:val="num" w:pos="1800"/>
         </w:tabs>
-        <w:ind w:left="1080"/>
+        <w:ind w:left="1800"/>
         <w:rPr>
           <w:rFonts w:ascii="David" w:hAnsi="David" w:cs="David"/>
         </w:rPr>
@@ -1482,18 +1518,46 @@
         </w:numPr>
         <w:tabs>
           <w:tab w:val="clear" w:pos="720"/>
-          <w:tab w:val="num" w:pos="1080"/>
+          <w:tab w:val="num" w:pos="1800"/>
         </w:tabs>
-        <w:ind w:left="1080"/>
-        <w:rPr>
-          <w:rFonts w:ascii="David" w:hAnsi="David" w:cs="David"/>
-        </w:rPr>
-      </w:pPr>
-      <w:r>
-        <w:rPr>
-          <w:rFonts w:ascii="David" w:hAnsi="David" w:cs="David"/>
-        </w:rPr>
-        <w:t>The Action: Subtracting the mean is like Down-conversion or Carrier Suppression. By removing the "Carrier" (the fixed average), you are left with the Baseband signal—the raw information about which numbers appear and when.</w:t>
+        <w:ind w:left="1800"/>
+        <w:rPr>
+          <w:rFonts w:ascii="David" w:hAnsi="David" w:cs="David"/>
+        </w:rPr>
+      </w:pPr>
+      <w:r>
+        <w:rPr>
+          <w:rFonts w:ascii="David" w:hAnsi="David" w:cs="David"/>
+        </w:rPr>
+        <w:t xml:space="preserve">The Action: Subtracting the </w:t>
+      </w:r>
+      <w:proofErr w:type="gramStart"/>
+      <w:r>
+        <w:rPr>
+          <w:rFonts w:ascii="David" w:hAnsi="David" w:cs="David"/>
+        </w:rPr>
+        <w:t>mean</w:t>
+      </w:r>
+      <w:proofErr w:type="gramEnd"/>
+      <w:r>
+        <w:rPr>
+          <w:rFonts w:ascii="David" w:hAnsi="David" w:cs="David"/>
+        </w:rPr>
+        <w:t xml:space="preserve"> is like Down-conversion or Carrier Suppression. By removing the "Carrier" (the fixed average), you are left with the Baseband </w:t>
+      </w:r>
+      <w:proofErr w:type="gramStart"/>
+      <w:r>
+        <w:rPr>
+          <w:rFonts w:ascii="David" w:hAnsi="David" w:cs="David"/>
+        </w:rPr>
+        <w:t>signal—</w:t>
+      </w:r>
+      <w:proofErr w:type="gramEnd"/>
+      <w:r>
+        <w:rPr>
+          <w:rFonts w:ascii="David" w:hAnsi="David" w:cs="David"/>
+        </w:rPr>
+        <w:t>the raw information about which numbers appear and when.</w:t>
       </w:r>
     </w:p>
     <w:p>
@@ -1538,6 +1602,7 @@
     <w:p>
       <w:pPr>
         <w:pStyle w:val="ListParagraph"/>
+        <w:ind w:left="1440"/>
         <w:rPr>
           <w:rFonts w:ascii="David" w:hAnsi="David" w:cs="David"/>
         </w:rPr>
@@ -1569,7 +1634,7 @@
     </w:p>
     <w:p>
       <w:pPr>
-        <w:ind w:left="720"/>
+        <w:ind w:left="1440"/>
         <w:rPr>
           <w:rFonts w:ascii="David" w:eastAsiaTheme="minorEastAsia" w:hAnsi="David" w:cs="David"/>
         </w:rPr>
@@ -1645,7 +1710,7 @@
     </w:p>
     <w:p>
       <w:pPr>
-        <w:ind w:left="720"/>
+        <w:ind w:left="1440"/>
         <w:rPr>
           <w:rFonts w:ascii="David" w:eastAsiaTheme="minorEastAsia" w:hAnsi="David" w:cs="David"/>
         </w:rPr>
@@ -1665,7 +1730,7 @@
     </w:p>
     <w:p>
       <w:pPr>
-        <w:ind w:left="720"/>
+        <w:ind w:left="1440"/>
         <w:rPr>
           <w:rFonts w:ascii="David" w:eastAsiaTheme="minorEastAsia" w:hAnsi="David" w:cs="David"/>
           <w:rtl/>
@@ -1794,20 +1859,35 @@
           <w:rFonts w:ascii="David" w:hAnsi="David" w:cs="David"/>
           <w:u w:val="single"/>
         </w:rPr>
-        <w:t>Visual Graphs</w:t>
-      </w:r>
+        <w:t xml:space="preserve">Visual </w:t>
+      </w:r>
+      <w:proofErr w:type="gramStart"/>
       <w:r>
         <w:rPr>
           <w:rFonts w:ascii="David" w:hAnsi="David" w:cs="David"/>
           <w:u w:val="single"/>
         </w:rPr>
+        <w:t>Graphs</w:t>
+      </w:r>
+      <w:r>
+        <w:rPr>
+          <w:rFonts w:ascii="David" w:hAnsi="David" w:cs="David"/>
+          <w:u w:val="single"/>
+        </w:rPr>
         <w:t xml:space="preserve"> </w:t>
       </w:r>
       <w:r>
         <w:rPr>
           <w:rFonts w:ascii="David" w:hAnsi="David" w:cs="David"/>
         </w:rPr>
-        <w:t xml:space="preserve"> - </w:t>
+        <w:t xml:space="preserve"> -</w:t>
+      </w:r>
+      <w:proofErr w:type="gramEnd"/>
+      <w:r>
+        <w:rPr>
+          <w:rFonts w:ascii="David" w:hAnsi="David" w:cs="David"/>
+        </w:rPr>
+        <w:t xml:space="preserve"> </w:t>
       </w:r>
       <w:r>
         <w:rPr>
@@ -1840,19 +1920,20 @@
           <w:rFonts w:ascii="David" w:hAnsi="David" w:cs="David"/>
           <w:u w:val="single"/>
         </w:rPr>
-        <w:t>FFT analysis</w:t>
-      </w:r>
-      <w:r>
-        <w:rPr>
-          <w:rFonts w:ascii="David" w:hAnsi="David" w:cs="David"/>
-        </w:rPr>
-        <w:t xml:space="preserve"> – in order to examine if there’s any periodic ball (normal or special), there will be 2 methods of feature extraction from the frequency function</w:t>
-      </w:r>
-      <w:r>
-        <w:rPr>
-          <w:rFonts w:ascii="David" w:hAnsi="David" w:cs="David"/>
-        </w:rPr>
-        <w:t>:</w:t>
+        <w:t>Frequency domain</w:t>
+      </w:r>
+      <w:r>
+        <w:rPr>
+          <w:rFonts w:ascii="David" w:hAnsi="David" w:cs="David"/>
+          <w:u w:val="single"/>
+        </w:rPr>
+        <w:t xml:space="preserve"> analysis</w:t>
+      </w:r>
+      <w:r>
+        <w:rPr>
+          <w:rFonts w:ascii="David" w:hAnsi="David" w:cs="David"/>
+        </w:rPr>
+        <w:t xml:space="preserve"> </w:t>
       </w:r>
     </w:p>
     <w:p>
@@ -1862,13 +1943,27 @@
           <w:rFonts w:ascii="David" w:hAnsi="David" w:cs="David"/>
         </w:rPr>
       </w:pPr>
+    </w:p>
+    <w:p>
+      <w:pPr>
+        <w:ind w:left="1440"/>
+        <w:rPr>
+          <w:rFonts w:ascii="David" w:hAnsi="David" w:cs="David"/>
+        </w:rPr>
+      </w:pPr>
+      <w:r>
+        <w:rPr>
+          <w:rFonts w:ascii="David" w:hAnsi="David" w:cs="David"/>
+        </w:rPr>
+        <w:t xml:space="preserve">The spectral analysis performed on the lottery datasets utilizes two primary statistical filters to distinguish meaningful periodic patterns from random stochastic noise: </w:t>
+      </w:r>
     </w:p>
     <w:p>
       <w:pPr>
         <w:pStyle w:val="ListParagraph"/>
         <w:numPr>
           <w:ilvl w:val="1"/>
-          <w:numId w:val="4"/>
+          <w:numId w:val="8"/>
         </w:numPr>
         <w:rPr>
           <w:rFonts w:ascii="David" w:hAnsi="David" w:cs="David"/>
@@ -1878,7 +1973,7 @@
         <w:rPr>
           <w:rFonts w:ascii="David" w:hAnsi="David" w:cs="David"/>
         </w:rPr>
-        <w:t>Sigma – 3</w:t>
+        <w:t xml:space="preserve">3-Sigma threshold </w:t>
       </w:r>
     </w:p>
     <w:p>
@@ -1886,7 +1981,7 @@
         <w:pStyle w:val="ListParagraph"/>
         <w:numPr>
           <w:ilvl w:val="1"/>
-          <w:numId w:val="4"/>
+          <w:numId w:val="8"/>
         </w:numPr>
         <w:rPr>
           <w:rFonts w:ascii="David" w:hAnsi="David" w:cs="David"/>
@@ -1896,7 +1991,7 @@
         <w:rPr>
           <w:rFonts w:ascii="David" w:hAnsi="David" w:cs="David"/>
         </w:rPr>
-        <w:t>SNR &gt; 3 dB</w:t>
+        <w:t>Signal-to-Noise Ratio (SNR) limit.</w:t>
       </w:r>
     </w:p>
     <w:p>
@@ -1910,43 +2005,31 @@
     <w:p>
       <w:pPr>
         <w:pStyle w:val="ListParagraph"/>
-        <w:rPr>
-          <w:rFonts w:ascii="David" w:hAnsi="David" w:cs="David"/>
-        </w:rPr>
-      </w:pPr>
+        <w:ind w:left="1440"/>
+        <w:rPr>
+          <w:rFonts w:ascii="David" w:hAnsi="David" w:cs="David"/>
+        </w:rPr>
+      </w:pPr>
+      <w:r>
+        <w:rPr>
+          <w:rFonts w:ascii="David" w:hAnsi="David" w:cs="David"/>
+        </w:rPr>
+        <w:t xml:space="preserve">The 3-Sigma method relies on Gaussian distribution principles, identifying any frequency magnitude that deviates more than three standard deviations from the mean noise floor as a statistically significant anomaly with a 99.7% confidence level. </w:t>
+      </w:r>
     </w:p>
     <w:p>
       <w:pPr>
         <w:pStyle w:val="ListParagraph"/>
-        <w:rPr>
-          <w:rFonts w:ascii="David" w:hAnsi="David" w:cs="David"/>
-        </w:rPr>
-      </w:pPr>
-    </w:p>
-    <w:p>
-      <w:pPr>
-        <w:pStyle w:val="ListParagraph"/>
-        <w:rPr>
-          <w:rFonts w:ascii="David" w:hAnsi="David" w:cs="David"/>
-        </w:rPr>
-      </w:pPr>
-      <w:r>
-        <w:rPr>
-          <w:rFonts w:ascii="David" w:hAnsi="David" w:cs="David"/>
-        </w:rPr>
-        <w:t xml:space="preserve">collide all the ffts together to </w:t>
-      </w:r>
-      <w:r>
-        <w:rPr>
-          <w:rFonts w:ascii="David" w:hAnsi="David" w:cs="David"/>
-        </w:rPr>
-        <w:t>multichannel</w:t>
-      </w:r>
-      <w:r>
-        <w:rPr>
-          <w:rFonts w:ascii="David" w:hAnsi="David" w:cs="David"/>
-        </w:rPr>
-        <w:t xml:space="preserve"> graph in order to see clearly the freq of each ball</w:t>
+        <w:ind w:left="1440"/>
+        <w:rPr>
+          <w:rFonts w:ascii="David" w:hAnsi="David" w:cs="David"/>
+        </w:rPr>
+      </w:pPr>
+      <w:r>
+        <w:rPr>
+          <w:rFonts w:ascii="David" w:hAnsi="David" w:cs="David"/>
+        </w:rPr>
+        <w:t>Complementing this, the SNR threshold identifies peaks where the signal power is at least 3dB above the average noise—effectively doubling the noise magnitude—ensuring that the detected cycles possess sufficient relative strength to be considered non-random. By cross-referencing these two metrics, the analysis provides a robust framework for identifying hidden periodicities, such as recurring number appearances or "rhythm" in the draws, which are then converted into practical time-domain periods.</w:t>
       </w:r>
     </w:p>
     <w:p>
@@ -1963,25 +2046,6 @@
           <w:rFonts w:ascii="David" w:hAnsi="David" w:cs="David"/>
         </w:rPr>
       </w:pPr>
-    </w:p>
-    <w:p>
-      <w:pPr>
-        <w:rPr>
-          <w:rFonts w:ascii="David" w:hAnsi="David" w:cs="David"/>
-          <w:b/>
-          <w:bCs/>
-          <w:u w:val="single"/>
-        </w:rPr>
-      </w:pPr>
-      <w:r>
-        <w:rPr>
-          <w:rFonts w:ascii="David" w:hAnsi="David" w:cs="David"/>
-          <w:b/>
-          <w:bCs/>
-          <w:u w:val="single"/>
-        </w:rPr>
-        <w:t>Data Analysis – the normal numbers</w:t>
-      </w:r>
     </w:p>
     <w:p>
       <w:pPr>
@@ -2274,9 +2338,9 @@
   </w:abstractNum>
   <w:abstractNum w:abstractNumId="2" w15:restartNumberingAfterBreak="0">
     <w:nsid w:val="1BD566EA"/>
-    <w:multiLevelType w:val="hybridMultilevel"/>
-    <w:tmpl w:val="C98E0AE8"/>
-    <w:lvl w:ilvl="0" w:tplc="0409000F">
+    <w:multiLevelType w:val="multilevel"/>
+    <w:tmpl w:val="4FB0AA7C"/>
+    <w:lvl w:ilvl="0">
       <w:start w:val="1"/>
       <w:numFmt w:val="decimal"/>
       <w:lvlText w:val="%1."/>
@@ -2288,77 +2352,117 @@
         <w:rFonts w:hint="default"/>
       </w:rPr>
     </w:lvl>
-    <w:lvl w:ilvl="1" w:tplc="04090019" w:tentative="1">
-      <w:start w:val="1"/>
-      <w:numFmt w:val="lowerLetter"/>
-      <w:lvlText w:val="%2."/>
-      <w:lvlJc w:val="left"/>
-      <w:pPr>
-        <w:ind w:left="1440" w:hanging="360"/>
-      </w:pPr>
-    </w:lvl>
-    <w:lvl w:ilvl="2" w:tplc="0409001B" w:tentative="1">
-      <w:start w:val="1"/>
-      <w:numFmt w:val="lowerRoman"/>
-      <w:lvlText w:val="%3."/>
-      <w:lvlJc w:val="right"/>
-      <w:pPr>
-        <w:ind w:left="2160" w:hanging="180"/>
-      </w:pPr>
-    </w:lvl>
-    <w:lvl w:ilvl="3" w:tplc="0409000F" w:tentative="1">
+    <w:lvl w:ilvl="1">
       <w:start w:val="1"/>
       <w:numFmt w:val="decimal"/>
-      <w:lvlText w:val="%4."/>
-      <w:lvlJc w:val="left"/>
-      <w:pPr>
-        <w:ind w:left="2880" w:hanging="360"/>
-      </w:pPr>
-    </w:lvl>
-    <w:lvl w:ilvl="4" w:tplc="04090019" w:tentative="1">
-      <w:start w:val="1"/>
-      <w:numFmt w:val="lowerLetter"/>
-      <w:lvlText w:val="%5."/>
-      <w:lvlJc w:val="left"/>
-      <w:pPr>
-        <w:ind w:left="3600" w:hanging="360"/>
-      </w:pPr>
-    </w:lvl>
-    <w:lvl w:ilvl="5" w:tplc="0409001B" w:tentative="1">
-      <w:start w:val="1"/>
-      <w:numFmt w:val="lowerRoman"/>
-      <w:lvlText w:val="%6."/>
-      <w:lvlJc w:val="right"/>
-      <w:pPr>
-        <w:ind w:left="4320" w:hanging="180"/>
-      </w:pPr>
-    </w:lvl>
-    <w:lvl w:ilvl="6" w:tplc="0409000F" w:tentative="1">
+      <w:isLgl/>
+      <w:lvlText w:val="%1.%2"/>
+      <w:lvlJc w:val="left"/>
+      <w:pPr>
+        <w:ind w:left="720" w:hanging="360"/>
+      </w:pPr>
+      <w:rPr>
+        <w:rFonts w:hint="default"/>
+        <w:u w:val="none"/>
+      </w:rPr>
+    </w:lvl>
+    <w:lvl w:ilvl="2">
       <w:start w:val="1"/>
       <w:numFmt w:val="decimal"/>
-      <w:lvlText w:val="%7."/>
-      <w:lvlJc w:val="left"/>
-      <w:pPr>
-        <w:ind w:left="5040" w:hanging="360"/>
-      </w:pPr>
-    </w:lvl>
-    <w:lvl w:ilvl="7" w:tplc="04090019" w:tentative="1">
-      <w:start w:val="1"/>
-      <w:numFmt w:val="lowerLetter"/>
-      <w:lvlText w:val="%8."/>
-      <w:lvlJc w:val="left"/>
-      <w:pPr>
-        <w:ind w:left="5760" w:hanging="360"/>
-      </w:pPr>
-    </w:lvl>
-    <w:lvl w:ilvl="8" w:tplc="0409001B" w:tentative="1">
-      <w:start w:val="1"/>
-      <w:numFmt w:val="lowerRoman"/>
-      <w:lvlText w:val="%9."/>
-      <w:lvlJc w:val="right"/>
-      <w:pPr>
-        <w:ind w:left="6480" w:hanging="180"/>
-      </w:pPr>
+      <w:isLgl/>
+      <w:lvlText w:val="%1.%2.%3"/>
+      <w:lvlJc w:val="left"/>
+      <w:pPr>
+        <w:ind w:left="1080" w:hanging="720"/>
+      </w:pPr>
+      <w:rPr>
+        <w:rFonts w:hint="default"/>
+        <w:u w:val="single"/>
+      </w:rPr>
+    </w:lvl>
+    <w:lvl w:ilvl="3">
+      <w:start w:val="1"/>
+      <w:numFmt w:val="decimal"/>
+      <w:isLgl/>
+      <w:lvlText w:val="%1.%2.%3.%4"/>
+      <w:lvlJc w:val="left"/>
+      <w:pPr>
+        <w:ind w:left="1080" w:hanging="720"/>
+      </w:pPr>
+      <w:rPr>
+        <w:rFonts w:hint="default"/>
+        <w:u w:val="single"/>
+      </w:rPr>
+    </w:lvl>
+    <w:lvl w:ilvl="4">
+      <w:start w:val="1"/>
+      <w:numFmt w:val="decimal"/>
+      <w:isLgl/>
+      <w:lvlText w:val="%1.%2.%3.%4.%5"/>
+      <w:lvlJc w:val="left"/>
+      <w:pPr>
+        <w:ind w:left="1440" w:hanging="1080"/>
+      </w:pPr>
+      <w:rPr>
+        <w:rFonts w:hint="default"/>
+        <w:u w:val="single"/>
+      </w:rPr>
+    </w:lvl>
+    <w:lvl w:ilvl="5">
+      <w:start w:val="1"/>
+      <w:numFmt w:val="decimal"/>
+      <w:isLgl/>
+      <w:lvlText w:val="%1.%2.%3.%4.%5.%6"/>
+      <w:lvlJc w:val="left"/>
+      <w:pPr>
+        <w:ind w:left="1440" w:hanging="1080"/>
+      </w:pPr>
+      <w:rPr>
+        <w:rFonts w:hint="default"/>
+        <w:u w:val="single"/>
+      </w:rPr>
+    </w:lvl>
+    <w:lvl w:ilvl="6">
+      <w:start w:val="1"/>
+      <w:numFmt w:val="decimal"/>
+      <w:isLgl/>
+      <w:lvlText w:val="%1.%2.%3.%4.%5.%6.%7"/>
+      <w:lvlJc w:val="left"/>
+      <w:pPr>
+        <w:ind w:left="1440" w:hanging="1080"/>
+      </w:pPr>
+      <w:rPr>
+        <w:rFonts w:hint="default"/>
+        <w:u w:val="single"/>
+      </w:rPr>
+    </w:lvl>
+    <w:lvl w:ilvl="7">
+      <w:start w:val="1"/>
+      <w:numFmt w:val="decimal"/>
+      <w:isLgl/>
+      <w:lvlText w:val="%1.%2.%3.%4.%5.%6.%7.%8"/>
+      <w:lvlJc w:val="left"/>
+      <w:pPr>
+        <w:ind w:left="1800" w:hanging="1440"/>
+      </w:pPr>
+      <w:rPr>
+        <w:rFonts w:hint="default"/>
+        <w:u w:val="single"/>
+      </w:rPr>
+    </w:lvl>
+    <w:lvl w:ilvl="8">
+      <w:start w:val="1"/>
+      <w:numFmt w:val="decimal"/>
+      <w:isLgl/>
+      <w:lvlText w:val="%1.%2.%3.%4.%5.%6.%7.%8.%9"/>
+      <w:lvlJc w:val="left"/>
+      <w:pPr>
+        <w:ind w:left="1800" w:hanging="1440"/>
+      </w:pPr>
+      <w:rPr>
+        <w:rFonts w:hint="default"/>
+        <w:u w:val="single"/>
+      </w:rPr>
     </w:lvl>
   </w:abstractNum>
   <w:abstractNum w:abstractNumId="3" w15:restartNumberingAfterBreak="0">
@@ -2812,7 +2916,7 @@
         <w:rFonts w:ascii="David" w:eastAsiaTheme="minorHAnsi" w:hAnsi="David" w:cs="David" w:hint="default"/>
       </w:rPr>
     </w:lvl>
-    <w:lvl w:ilvl="1" w:tplc="04090003" w:tentative="1">
+    <w:lvl w:ilvl="1" w:tplc="04090003">
       <w:start w:val="1"/>
       <w:numFmt w:val="bullet"/>
       <w:lvlText w:val="o"/>
@@ -3539,7 +3643,6 @@
   <w:style w:type="character" w:default="1" w:styleId="DefaultParagraphFont">
     <w:name w:val="Default Paragraph Font"/>
     <w:uiPriority w:val="1"/>
-    <w:semiHidden/>
     <w:unhideWhenUsed/>
   </w:style>
   <w:style w:type="table" w:default="1" w:styleId="TableNormal">

</xml_diff>